<commit_message>
Kiểm chứng CSDL PostGIS chạy thật + bổ sung kết quả vào báo cáo
- Chạy schema.sql và seed.sql trên PostgreSQL 17.6 + PostGIS 3.6.2: tạo 15
  bảng, 4 hàm, 1 trigger; ba tình huống kiểm thử cho đúng HOP_LE / NGHI_NGO /
  NGOAI_VUNG, trigger suy cao độ khớp công thức trong báo cáo
- Kiểm tra thêm hàm kiem_tra_r2 (dịch chuyển bất khả thi) — chưa từng chạy trước đó
- db/README.md: hướng dẫn dựng PostgreSQL+PostGIS portable, không cần admin/Docker
- Checkpoint 1: thêm mục "Kiểm chứng phần cơ sở dữ liệu" và Bảng 4.2
- build_checkpoint1.py: tự dùng bản đã sinh làm nguồn style khi thiếu file mẫu
</commit_message>
<xml_diff>
--- a/ie402-chamcong-3d/CHECKPOINT1-Cham-cong-dinh-vi-3D.docx
+++ b/ie402-chamcong-3d/CHECKPOINT1-Cham-cong-dinh-vi-3D.docx
@@ -621,6 +621,19 @@
         <w:t>Bảng 4.1</w:t>
         <w:tab/>
         <w:t>Kết quả ba tình huống kiểm thử</w:t>
+      </w:r>
+    </w:p>
+    <w:p>
+      <w:r>
+        <w:rPr>
+          <w:rFonts w:ascii="Times New Roman" w:hAnsi="Times New Roman" w:cs="Times New Roman" w:eastAsia="Times New Roman"/>
+          <w:b w:val="0"/>
+          <w:i w:val="0"/>
+          <w:sz w:val="26"/>
+        </w:rPr>
+        <w:t>Bảng 4.2</w:t>
+        <w:tab/>
+        <w:t>Kết quả chạy thật trên PostgreSQL + PostGIS</w:t>
       </w:r>
     </w:p>
     <w:p>
@@ -9223,7 +9236,7 @@
               <a:graphicData uri="http://schemas.openxmlformats.org/drawingml/2006/picture">
                 <pic:pic>
                   <pic:nvPicPr>
-                    <pic:cNvPr id="0" name="01-erd.png"/>
+                    <pic:cNvPr id="0" name="image.png"/>
                     <pic:cNvPicPr/>
                   </pic:nvPicPr>
                   <pic:blipFill>
@@ -9313,7 +9326,7 @@
               <a:graphicData uri="http://schemas.openxmlformats.org/drawingml/2006/picture">
                 <pic:pic>
                   <pic:nvPicPr>
-                    <pic:cNvPr id="0" name="02-usecase.png"/>
+                    <pic:cNvPr id="0" name="image.png"/>
                     <pic:cNvPicPr/>
                   </pic:nvPicPr>
                   <pic:blipFill>
@@ -10292,7 +10305,7 @@
               <a:graphicData uri="http://schemas.openxmlformats.org/drawingml/2006/picture">
                 <pic:pic>
                   <pic:nvPicPr>
-                    <pic:cNvPr id="0" name="03-dfd0.png"/>
+                    <pic:cNvPr id="0" name="image.png"/>
                     <pic:cNvPicPr/>
                   </pic:nvPicPr>
                   <pic:blipFill>
@@ -10367,7 +10380,7 @@
               <a:graphicData uri="http://schemas.openxmlformats.org/drawingml/2006/picture">
                 <pic:pic>
                   <pic:nvPicPr>
-                    <pic:cNvPr id="0" name="04-dfd1.png"/>
+                    <pic:cNvPr id="0" name="image.png"/>
                     <pic:cNvPicPr/>
                   </pic:nvPicPr>
                   <pic:blipFill>
@@ -11133,7 +11146,7 @@
               <a:graphicData uri="http://schemas.openxmlformats.org/drawingml/2006/picture">
                 <pic:pic>
                   <pic:nvPicPr>
-                    <pic:cNvPr id="0" name="05-sd1-cham-cong.png"/>
+                    <pic:cNvPr id="0" name="image.png"/>
                     <pic:cNvPicPr/>
                   </pic:nvPicPr>
                   <pic:blipFill>
@@ -11223,7 +11236,7 @@
               <a:graphicData uri="http://schemas.openxmlformats.org/drawingml/2006/picture">
                 <pic:pic>
                   <pic:nvPicPr>
-                    <pic:cNvPr id="0" name="06-sd2-dung-khoi.png"/>
+                    <pic:cNvPr id="0" name="image.png"/>
                     <pic:cNvPicPr/>
                   </pic:nvPicPr>
                   <pic:blipFill>
@@ -11298,7 +11311,7 @@
               <a:graphicData uri="http://schemas.openxmlformats.org/drawingml/2006/picture">
                 <pic:pic>
                   <pic:nvPicPr>
-                    <pic:cNvPr id="0" name="07-sd3-giai-trinh.png"/>
+                    <pic:cNvPr id="0" name="image.png"/>
                     <pic:cNvPicPr/>
                   </pic:nvPicPr>
                   <pic:blipFill>
@@ -12523,7 +12536,7 @@
               <a:graphicData uri="http://schemas.openxmlformats.org/drawingml/2006/picture">
                 <pic:pic>
                   <pic:nvPicPr>
-                    <pic:cNvPr id="0" name="01-ba-khoi-MAP.png"/>
+                    <pic:cNvPr id="0" name="image.png"/>
                     <pic:cNvPicPr/>
                   </pic:nvPicPr>
                   <pic:blipFill>
@@ -13171,7 +13184,7 @@
               <a:graphicData uri="http://schemas.openxmlformats.org/drawingml/2006/picture">
                 <pic:pic>
                   <pic:nvPicPr>
-                    <pic:cNvPr id="0" name="02-ket-qua-nghi-ngo.png"/>
+                    <pic:cNvPr id="0" name="image.png"/>
                     <pic:cNvPicPr/>
                   </pic:nvPicPr>
                   <pic:blipFill>
@@ -13208,6 +13221,313 @@
         <w:t>Hình 4.1 — Kết quả tình huống chấm công sai tầng; điểm chấm công (hình cầu) nằm trong khối của doanh nghiệp khác</w:t>
       </w:r>
     </w:p>
+    <w:p/>
+    <w:p/>
+    <w:p>
+      <w:r>
+        <w:rPr>
+          <w:rFonts w:ascii="Times New Roman" w:hAnsi="Times New Roman" w:cs="Times New Roman" w:eastAsia="Times New Roman"/>
+          <w:b/>
+          <w:i w:val="0"/>
+          <w:sz w:val="26"/>
+        </w:rPr>
+        <w:t>Kiểm chứng phần cơ sở dữ liệu</w:t>
+      </w:r>
+    </w:p>
+    <w:p>
+      <w:pPr>
+        <w:ind w:firstLine="432"/>
+        <w:jc w:val="both"/>
+      </w:pPr>
+      <w:r>
+        <w:rPr>
+          <w:rFonts w:ascii="Times New Roman" w:hAnsi="Times New Roman" w:cs="Times New Roman" w:eastAsia="Times New Roman"/>
+          <w:b w:val="0"/>
+          <w:i w:val="0"/>
+          <w:sz w:val="26"/>
+        </w:rPr>
+        <w:t>Toàn bộ lược đồ và các hàm nghiệp vụ đã được chạy thật trên PostgreSQL 17.6 kết hợp PostGIS 3.6.2, không dừng ở mức mã nguồn. Kết quả trên cơ sở dữ liệu trùng khớp với bản cài đặt bằng JavaScript ở phía trình duyệt, xác nhận hai bên dùng chung một thuật toán.</w:t>
+      </w:r>
+    </w:p>
+    <w:p>
+      <w:pPr>
+        <w:jc w:val="center"/>
+      </w:pPr>
+      <w:r>
+        <w:rPr>
+          <w:rFonts w:ascii="Times New Roman" w:hAnsi="Times New Roman" w:cs="Times New Roman" w:eastAsia="Times New Roman"/>
+          <w:b w:val="0"/>
+          <w:i/>
+          <w:sz w:val="20"/>
+        </w:rPr>
+        <w:t>Bảng 4.2 — Kết quả chạy thật trên PostgreSQL 17.6 + PostGIS 3.6.2</w:t>
+      </w:r>
+    </w:p>
+    <w:tbl>
+      <w:tblPr>
+        <w:tblStyle w:val="TableGrid"/>
+        <w:tblW w:type="auto" w:w="0"/>
+        <w:tblLook w:firstColumn="1" w:firstRow="1" w:lastColumn="0" w:lastRow="0" w:noHBand="0" w:noVBand="1" w:val="04A0"/>
+      </w:tblPr>
+      <w:tblGrid>
+        <w:gridCol w:w="4535"/>
+        <w:gridCol w:w="4535"/>
+      </w:tblGrid>
+      <w:tr>
+        <w:tc>
+          <w:tcPr>
+            <w:tcW w:type="dxa" w:w="3456"/>
+          </w:tcPr>
+          <w:p>
+            <w:r>
+              <w:rPr>
+                <w:rFonts w:ascii="Times New Roman" w:hAnsi="Times New Roman" w:cs="Times New Roman" w:eastAsia="Times New Roman"/>
+                <w:sz w:val="26"/>
+              </w:rPr>
+            </w:r>
+            <w:r>
+              <w:rPr>
+                <w:rFonts w:ascii="Times New Roman" w:hAnsi="Times New Roman" w:cs="Times New Roman" w:eastAsia="Times New Roman"/>
+                <w:b/>
+                <w:sz w:val="20"/>
+              </w:rPr>
+              <w:t>Hạng mục kiểm chứng</w:t>
+            </w:r>
+          </w:p>
+        </w:tc>
+        <w:tc>
+          <w:tcPr>
+            <w:tcW w:type="dxa" w:w="5328"/>
+          </w:tcPr>
+          <w:p>
+            <w:r>
+              <w:rPr>
+                <w:rFonts w:ascii="Times New Roman" w:hAnsi="Times New Roman" w:cs="Times New Roman" w:eastAsia="Times New Roman"/>
+                <w:sz w:val="26"/>
+              </w:rPr>
+            </w:r>
+            <w:r>
+              <w:rPr>
+                <w:rFonts w:ascii="Times New Roman" w:hAnsi="Times New Roman" w:cs="Times New Roman" w:eastAsia="Times New Roman"/>
+                <w:b/>
+                <w:sz w:val="20"/>
+              </w:rPr>
+              <w:t>Kết quả</w:t>
+            </w:r>
+          </w:p>
+        </w:tc>
+      </w:tr>
+      <w:tr>
+        <w:tc>
+          <w:tcPr>
+            <w:tcW w:type="dxa" w:w="3456"/>
+          </w:tcPr>
+          <w:p>
+            <w:r>
+              <w:rPr>
+                <w:rFonts w:ascii="Times New Roman" w:hAnsi="Times New Roman" w:cs="Times New Roman" w:eastAsia="Times New Roman"/>
+                <w:sz w:val="26"/>
+              </w:rPr>
+            </w:r>
+            <w:r>
+              <w:rPr>
+                <w:rFonts w:ascii="Times New Roman" w:hAnsi="Times New Roman" w:cs="Times New Roman" w:eastAsia="Times New Roman"/>
+                <w:sz w:val="20"/>
+              </w:rPr>
+              <w:t>Chạy schema.sql</w:t>
+            </w:r>
+          </w:p>
+        </w:tc>
+        <w:tc>
+          <w:tcPr>
+            <w:tcW w:type="dxa" w:w="5328"/>
+          </w:tcPr>
+          <w:p>
+            <w:r>
+              <w:rPr>
+                <w:rFonts w:ascii="Times New Roman" w:hAnsi="Times New Roman" w:cs="Times New Roman" w:eastAsia="Times New Roman"/>
+                <w:sz w:val="26"/>
+              </w:rPr>
+            </w:r>
+            <w:r>
+              <w:rPr>
+                <w:rFonts w:ascii="Times New Roman" w:hAnsi="Times New Roman" w:cs="Times New Roman" w:eastAsia="Times New Roman"/>
+                <w:sz w:val="20"/>
+              </w:rPr>
+              <w:t>Thành công, tạo 15 bảng, 4 hàm và 1 trigger</w:t>
+            </w:r>
+          </w:p>
+        </w:tc>
+      </w:tr>
+      <w:tr>
+        <w:tc>
+          <w:tcPr>
+            <w:tcW w:type="dxa" w:w="3456"/>
+          </w:tcPr>
+          <w:p>
+            <w:r>
+              <w:rPr>
+                <w:rFonts w:ascii="Times New Roman" w:hAnsi="Times New Roman" w:cs="Times New Roman" w:eastAsia="Times New Roman"/>
+                <w:sz w:val="26"/>
+              </w:rPr>
+            </w:r>
+            <w:r>
+              <w:rPr>
+                <w:rFonts w:ascii="Times New Roman" w:hAnsi="Times New Roman" w:cs="Times New Roman" w:eastAsia="Times New Roman"/>
+                <w:sz w:val="20"/>
+              </w:rPr>
+              <w:t>Chạy seed.sql</w:t>
+            </w:r>
+          </w:p>
+        </w:tc>
+        <w:tc>
+          <w:tcPr>
+            <w:tcW w:type="dxa" w:w="5328"/>
+          </w:tcPr>
+          <w:p>
+            <w:r>
+              <w:rPr>
+                <w:rFonts w:ascii="Times New Roman" w:hAnsi="Times New Roman" w:cs="Times New Roman" w:eastAsia="Times New Roman"/>
+                <w:sz w:val="26"/>
+              </w:rPr>
+            </w:r>
+            <w:r>
+              <w:rPr>
+                <w:rFonts w:ascii="Times New Roman" w:hAnsi="Times New Roman" w:cs="Times New Roman" w:eastAsia="Times New Roman"/>
+                <w:sz w:val="20"/>
+              </w:rPr>
+              <w:t>Thành công, nạp dữ liệu toà nhà IFC One Saigon và ba văn phòng</w:t>
+            </w:r>
+          </w:p>
+        </w:tc>
+      </w:tr>
+      <w:tr>
+        <w:tc>
+          <w:tcPr>
+            <w:tcW w:type="dxa" w:w="3456"/>
+          </w:tcPr>
+          <w:p>
+            <w:r>
+              <w:rPr>
+                <w:rFonts w:ascii="Times New Roman" w:hAnsi="Times New Roman" w:cs="Times New Roman" w:eastAsia="Times New Roman"/>
+                <w:sz w:val="26"/>
+              </w:rPr>
+            </w:r>
+            <w:r>
+              <w:rPr>
+                <w:rFonts w:ascii="Times New Roman" w:hAnsi="Times New Roman" w:cs="Times New Roman" w:eastAsia="Times New Roman"/>
+                <w:sz w:val="20"/>
+              </w:rPr>
+              <w:t>Trigger suy cao độ từ dải tầng</w:t>
+            </w:r>
+          </w:p>
+        </w:tc>
+        <w:tc>
+          <w:tcPr>
+            <w:tcW w:type="dxa" w:w="5328"/>
+          </w:tcPr>
+          <w:p>
+            <w:r>
+              <w:rPr>
+                <w:rFonts w:ascii="Times New Roman" w:hAnsi="Times New Roman" w:cs="Times New Roman" w:eastAsia="Times New Roman"/>
+                <w:sz w:val="26"/>
+              </w:rPr>
+            </w:r>
+            <w:r>
+              <w:rPr>
+                <w:rFonts w:ascii="Times New Roman" w:hAnsi="Times New Roman" w:cs="Times New Roman" w:eastAsia="Times New Roman"/>
+                <w:sz w:val="20"/>
+              </w:rPr>
+              <w:t>Alpha 23,60–42,20 m · Beta 93,35–116,60 m · Gamma 163,10–191,00 m, đúng công thức ở mục 2.1.3</w:t>
+            </w:r>
+          </w:p>
+        </w:tc>
+      </w:tr>
+      <w:tr>
+        <w:tc>
+          <w:tcPr>
+            <w:tcW w:type="dxa" w:w="3456"/>
+          </w:tcPr>
+          <w:p>
+            <w:r>
+              <w:rPr>
+                <w:rFonts w:ascii="Times New Roman" w:hAnsi="Times New Roman" w:cs="Times New Roman" w:eastAsia="Times New Roman"/>
+                <w:sz w:val="26"/>
+              </w:rPr>
+            </w:r>
+            <w:r>
+              <w:rPr>
+                <w:rFonts w:ascii="Times New Roman" w:hAnsi="Times New Roman" w:cs="Times New Roman" w:eastAsia="Times New Roman"/>
+                <w:sz w:val="20"/>
+              </w:rPr>
+              <w:t>Hàm kiem_tra_bao_ham()</w:t>
+            </w:r>
+          </w:p>
+        </w:tc>
+        <w:tc>
+          <w:tcPr>
+            <w:tcW w:type="dxa" w:w="5328"/>
+          </w:tcPr>
+          <w:p>
+            <w:r>
+              <w:rPr>
+                <w:rFonts w:ascii="Times New Roman" w:hAnsi="Times New Roman" w:cs="Times New Roman" w:eastAsia="Times New Roman"/>
+                <w:sz w:val="26"/>
+              </w:rPr>
+            </w:r>
+            <w:r>
+              <w:rPr>
+                <w:rFonts w:ascii="Times New Roman" w:hAnsi="Times New Roman" w:cs="Times New Roman" w:eastAsia="Times New Roman"/>
+                <w:sz w:val="20"/>
+              </w:rPr>
+              <w:t>Đúng tầng → HOP_LE; sai tầng → NGHI_NGO; ngoài toà nhà → NGOAI_VUNG</w:t>
+            </w:r>
+          </w:p>
+        </w:tc>
+      </w:tr>
+      <w:tr>
+        <w:tc>
+          <w:tcPr>
+            <w:tcW w:type="dxa" w:w="3456"/>
+          </w:tcPr>
+          <w:p>
+            <w:r>
+              <w:rPr>
+                <w:rFonts w:ascii="Times New Roman" w:hAnsi="Times New Roman" w:cs="Times New Roman" w:eastAsia="Times New Roman"/>
+                <w:sz w:val="26"/>
+              </w:rPr>
+            </w:r>
+            <w:r>
+              <w:rPr>
+                <w:rFonts w:ascii="Times New Roman" w:hAnsi="Times New Roman" w:cs="Times New Roman" w:eastAsia="Times New Roman"/>
+                <w:sz w:val="20"/>
+              </w:rPr>
+              <w:t>Hàm kiem_tra_r2() (dịch chuyển bất khả thi)</w:t>
+            </w:r>
+          </w:p>
+        </w:tc>
+        <w:tc>
+          <w:tcPr>
+            <w:tcW w:type="dxa" w:w="5328"/>
+          </w:tcPr>
+          <w:p>
+            <w:r>
+              <w:rPr>
+                <w:rFonts w:ascii="Times New Roman" w:hAnsi="Times New Roman" w:cs="Times New Roman" w:eastAsia="Times New Roman"/>
+                <w:sz w:val="26"/>
+              </w:rPr>
+            </w:r>
+            <w:r>
+              <w:rPr>
+                <w:rFonts w:ascii="Times New Roman" w:hAnsi="Times New Roman" w:cs="Times New Roman" w:eastAsia="Times New Roman"/>
+                <w:sz w:val="20"/>
+              </w:rPr>
+              <w:t>Chấm công lại sau 3 phút ở vị trí cách 200 km → phát hiện bất thường; cùng toạ độ → không cảnh báo</w:t>
+            </w:r>
+          </w:p>
+        </w:tc>
+      </w:tr>
+    </w:tbl>
     <w:p/>
     <w:p>
       <w:pPr>

</xml_diff>

<commit_message>
Cập nhật báo cáo Checkpoint 1 theo hệ thống đã cài đặt
- Chương 3: thêm mục "Cài đặt hệ thống" (kiến trúc ba lớp, logic không gian đặt
  trong CSDL, mỗi lần chấm công là một giao dịch), Bảng 3.2 liệt kê 11 điểm cuối
  API, và hai ảnh giao diện thật (Hình 3.2, 3.3)
- Chương 4: thêm "Kiểm chứng toàn hệ thống" và Bảng 4.3 — 7 kịch bản chạy đầu
  cuối qua API thật: R1–R4, chặn phân quyền 403, luồng duyệt đơn giải trình
- Cập nhật danh mục hình và danh mục bảng tương ứng
- build_docx.py: báo lỗi rõ ràng khi thiếu tệp mẫu của lớp thay vì đổ stack trace

Báo cáo giờ có 78 heading, 30 bảng, 12 hình.
</commit_message>
<xml_diff>
--- a/ie402-chamcong-3d/CHECKPOINT1-Cham-cong-dinh-vi-3D.docx
+++ b/ie402-chamcong-3d/CHECKPOINT1-Cham-cong-dinh-vi-3D.docx
@@ -499,6 +499,32 @@
           <w:i w:val="0"/>
           <w:sz w:val="26"/>
         </w:rPr>
+        <w:t>Hình 3.2</w:t>
+        <w:tab/>
+        <w:t>Màn hình chấm công của hệ thống đã cài đặt</w:t>
+      </w:r>
+    </w:p>
+    <w:p>
+      <w:r>
+        <w:rPr>
+          <w:rFonts w:ascii="Times New Roman" w:hAnsi="Times New Roman" w:cs="Times New Roman" w:eastAsia="Times New Roman"/>
+          <w:b w:val="0"/>
+          <w:i w:val="0"/>
+          <w:sz w:val="26"/>
+        </w:rPr>
+        <w:t>Hình 3.3</w:t>
+        <w:tab/>
+        <w:t>Bảng điều khiển của quản lý</w:t>
+      </w:r>
+    </w:p>
+    <w:p>
+      <w:r>
+        <w:rPr>
+          <w:rFonts w:ascii="Times New Roman" w:hAnsi="Times New Roman" w:cs="Times New Roman" w:eastAsia="Times New Roman"/>
+          <w:b w:val="0"/>
+          <w:i w:val="0"/>
+          <w:sz w:val="26"/>
+        </w:rPr>
         <w:t>Hình 4.1</w:t>
         <w:tab/>
         <w:t>Kết quả tình huống chấm công sai tầng</w:t>
@@ -631,9 +657,35 @@
           <w:i w:val="0"/>
           <w:sz w:val="26"/>
         </w:rPr>
+        <w:t>Bảng 3.2</w:t>
+        <w:tab/>
+        <w:t>Các điểm cuối API của hệ thống</w:t>
+      </w:r>
+    </w:p>
+    <w:p>
+      <w:r>
+        <w:rPr>
+          <w:rFonts w:ascii="Times New Roman" w:hAnsi="Times New Roman" w:cs="Times New Roman" w:eastAsia="Times New Roman"/>
+          <w:b w:val="0"/>
+          <w:i w:val="0"/>
+          <w:sz w:val="26"/>
+        </w:rPr>
         <w:t>Bảng 4.2</w:t>
         <w:tab/>
         <w:t>Kết quả chạy thật trên PostgreSQL + PostGIS</w:t>
+      </w:r>
+    </w:p>
+    <w:p>
+      <w:r>
+        <w:rPr>
+          <w:rFonts w:ascii="Times New Roman" w:hAnsi="Times New Roman" w:cs="Times New Roman" w:eastAsia="Times New Roman"/>
+          <w:b w:val="0"/>
+          <w:i w:val="0"/>
+          <w:sz w:val="26"/>
+        </w:rPr>
+        <w:t>Bảng 4.3</w:t>
+        <w:tab/>
+        <w:t>Kết quả kiểm thử đầu cuối trên hệ thống đã cài đặt</w:t>
       </w:r>
     </w:p>
     <w:p>
@@ -12652,6 +12704,1498 @@
       </w:r>
     </w:p>
     <w:p>
+      <w:pPr>
+        <w:numPr>
+          <w:ilvl w:val="0"/>
+          <w:numId w:val="0"/>
+        </w:numPr>
+        <w:pStyle w:val="Heading2"/>
+      </w:pPr>
+      <w:r>
+        <w:rPr>
+          <w:rFonts w:ascii="Times New Roman" w:hAnsi="Times New Roman" w:cs="Times New Roman" w:eastAsia="Times New Roman"/>
+        </w:rPr>
+        <w:t>3.9</w:t>
+        <w:tab/>
+        <w:t>Cài đặt hệ thống</w:t>
+      </w:r>
+    </w:p>
+    <w:p>
+      <w:pPr>
+        <w:ind w:firstLine="432"/>
+        <w:jc w:val="both"/>
+      </w:pPr>
+      <w:r>
+        <w:rPr>
+          <w:rFonts w:ascii="Times New Roman" w:hAnsi="Times New Roman" w:cs="Times New Roman" w:eastAsia="Times New Roman"/>
+          <w:b w:val="0"/>
+          <w:i w:val="0"/>
+          <w:sz w:val="26"/>
+        </w:rPr>
+        <w:t>Hệ thống đã được cài đặt hoàn chỉnh chứ không dừng ở bản mô phỏng thuật toán. Máy chủ viết bằng Node.js với Express, nói chuyện trực tiếp với PostgreSQL/PostGIS và phục vụ luôn giao diện web tĩnh, nên toàn bộ hệ thống chạy trên một cổng duy nhất — thuận lợi cho việc trình diễn vì Geolocation API chấp nhận localhost.</w:t>
+      </w:r>
+    </w:p>
+    <w:p>
+      <w:pPr>
+        <w:ind w:firstLine="432"/>
+        <w:jc w:val="both"/>
+      </w:pPr>
+      <w:r>
+        <w:rPr>
+          <w:rFonts w:ascii="Times New Roman" w:hAnsi="Times New Roman" w:cs="Times New Roman" w:eastAsia="Times New Roman"/>
+          <w:b w:val="0"/>
+          <w:i w:val="0"/>
+          <w:sz w:val="26"/>
+        </w:rPr>
+        <w:t>Điểm đáng chú ý về mặt kiến trúc: phép kiểm tra bao hàm khối không được viết lại ở tầng ứng dụng mà gọi thẳng hàm kiem_tra_bao_ham() và kiem_tra_r2() đã cài đặt trong cơ sở dữ liệu. Nhờ vậy logic không gian chỉ tồn tại một bản duy nhất, đặt ngay cạnh dữ liệu, tránh tình trạng hai nơi cùng cài đặt rồi lệch nhau.</w:t>
+      </w:r>
+    </w:p>
+    <w:p>
+      <w:pPr>
+        <w:ind w:firstLine="432"/>
+        <w:jc w:val="both"/>
+      </w:pPr>
+      <w:r>
+        <w:rPr>
+          <w:rFonts w:ascii="Times New Roman" w:hAnsi="Times New Roman" w:cs="Times New Roman" w:eastAsia="Times New Roman"/>
+          <w:b w:val="0"/>
+          <w:i w:val="0"/>
+          <w:sz w:val="26"/>
+        </w:rPr>
+        <w:t>Mỗi lần chấm công được xử lý trong một giao dịch: ghi bản ghi, áp bốn quy tắc R1–R4 rồi ghi các cảnh báo tương ứng. Nếu bất kỳ bước nào lỗi thì toàn bộ được huỷ, không để lại bản ghi dở dang.</w:t>
+      </w:r>
+    </w:p>
+    <w:tbl>
+      <w:tblPr>
+        <w:tblStyle w:val="TableGrid"/>
+        <w:tblW w:type="auto" w:w="0"/>
+        <w:tblLook w:firstColumn="1" w:firstRow="1" w:lastColumn="0" w:lastRow="0" w:noHBand="0" w:noVBand="1" w:val="04A0"/>
+      </w:tblPr>
+      <w:tblGrid>
+        <w:gridCol w:w="3024"/>
+        <w:gridCol w:w="3024"/>
+        <w:gridCol w:w="3024"/>
+      </w:tblGrid>
+      <w:tr>
+        <w:tc>
+          <w:tcPr>
+            <w:tcW w:type="dxa" w:w="1584"/>
+          </w:tcPr>
+          <w:p>
+            <w:r>
+              <w:rPr>
+                <w:rFonts w:ascii="Times New Roman" w:hAnsi="Times New Roman" w:cs="Times New Roman" w:eastAsia="Times New Roman"/>
+                <w:sz w:val="26"/>
+              </w:rPr>
+            </w:r>
+            <w:r>
+              <w:rPr>
+                <w:rFonts w:ascii="Times New Roman" w:hAnsi="Times New Roman" w:cs="Times New Roman" w:eastAsia="Times New Roman"/>
+                <w:b/>
+                <w:sz w:val="20"/>
+              </w:rPr>
+              <w:t>Thành phần</w:t>
+            </w:r>
+          </w:p>
+        </w:tc>
+        <w:tc>
+          <w:tcPr>
+            <w:tcW w:type="dxa" w:w="3024"/>
+          </w:tcPr>
+          <w:p>
+            <w:r>
+              <w:rPr>
+                <w:rFonts w:ascii="Times New Roman" w:hAnsi="Times New Roman" w:cs="Times New Roman" w:eastAsia="Times New Roman"/>
+                <w:sz w:val="26"/>
+              </w:rPr>
+            </w:r>
+            <w:r>
+              <w:rPr>
+                <w:rFonts w:ascii="Times New Roman" w:hAnsi="Times New Roman" w:cs="Times New Roman" w:eastAsia="Times New Roman"/>
+                <w:b/>
+                <w:sz w:val="20"/>
+              </w:rPr>
+              <w:t>Công nghệ</w:t>
+            </w:r>
+          </w:p>
+        </w:tc>
+        <w:tc>
+          <w:tcPr>
+            <w:tcW w:type="dxa" w:w="4176"/>
+          </w:tcPr>
+          <w:p>
+            <w:r>
+              <w:rPr>
+                <w:rFonts w:ascii="Times New Roman" w:hAnsi="Times New Roman" w:cs="Times New Roman" w:eastAsia="Times New Roman"/>
+                <w:sz w:val="26"/>
+              </w:rPr>
+            </w:r>
+            <w:r>
+              <w:rPr>
+                <w:rFonts w:ascii="Times New Roman" w:hAnsi="Times New Roman" w:cs="Times New Roman" w:eastAsia="Times New Roman"/>
+                <w:b/>
+                <w:sz w:val="20"/>
+              </w:rPr>
+              <w:t>Vai trò</w:t>
+            </w:r>
+          </w:p>
+        </w:tc>
+      </w:tr>
+      <w:tr>
+        <w:tc>
+          <w:tcPr>
+            <w:tcW w:type="dxa" w:w="1584"/>
+          </w:tcPr>
+          <w:p>
+            <w:r>
+              <w:rPr>
+                <w:rFonts w:ascii="Times New Roman" w:hAnsi="Times New Roman" w:cs="Times New Roman" w:eastAsia="Times New Roman"/>
+                <w:sz w:val="26"/>
+              </w:rPr>
+            </w:r>
+            <w:r>
+              <w:rPr>
+                <w:rFonts w:ascii="Times New Roman" w:hAnsi="Times New Roman" w:cs="Times New Roman" w:eastAsia="Times New Roman"/>
+                <w:sz w:val="20"/>
+              </w:rPr>
+              <w:t>server/</w:t>
+            </w:r>
+          </w:p>
+        </w:tc>
+        <w:tc>
+          <w:tcPr>
+            <w:tcW w:type="dxa" w:w="3024"/>
+          </w:tcPr>
+          <w:p>
+            <w:r>
+              <w:rPr>
+                <w:rFonts w:ascii="Times New Roman" w:hAnsi="Times New Roman" w:cs="Times New Roman" w:eastAsia="Times New Roman"/>
+                <w:sz w:val="26"/>
+              </w:rPr>
+            </w:r>
+            <w:r>
+              <w:rPr>
+                <w:rFonts w:ascii="Times New Roman" w:hAnsi="Times New Roman" w:cs="Times New Roman" w:eastAsia="Times New Roman"/>
+                <w:sz w:val="20"/>
+              </w:rPr>
+              <w:t>Node.js + Express + pg</w:t>
+            </w:r>
+          </w:p>
+        </w:tc>
+        <w:tc>
+          <w:tcPr>
+            <w:tcW w:type="dxa" w:w="4176"/>
+          </w:tcPr>
+          <w:p>
+            <w:r>
+              <w:rPr>
+                <w:rFonts w:ascii="Times New Roman" w:hAnsi="Times New Roman" w:cs="Times New Roman" w:eastAsia="Times New Roman"/>
+                <w:sz w:val="26"/>
+              </w:rPr>
+            </w:r>
+            <w:r>
+              <w:rPr>
+                <w:rFonts w:ascii="Times New Roman" w:hAnsi="Times New Roman" w:cs="Times New Roman" w:eastAsia="Times New Roman"/>
+                <w:sz w:val="20"/>
+              </w:rPr>
+              <w:t>11 điểm cuối API, xác thực JWT, phân quyền ba vai trò</w:t>
+            </w:r>
+          </w:p>
+        </w:tc>
+      </w:tr>
+      <w:tr>
+        <w:tc>
+          <w:tcPr>
+            <w:tcW w:type="dxa" w:w="1584"/>
+          </w:tcPr>
+          <w:p>
+            <w:r>
+              <w:rPr>
+                <w:rFonts w:ascii="Times New Roman" w:hAnsi="Times New Roman" w:cs="Times New Roman" w:eastAsia="Times New Roman"/>
+                <w:sz w:val="26"/>
+              </w:rPr>
+            </w:r>
+            <w:r>
+              <w:rPr>
+                <w:rFonts w:ascii="Times New Roman" w:hAnsi="Times New Roman" w:cs="Times New Roman" w:eastAsia="Times New Roman"/>
+                <w:sz w:val="20"/>
+              </w:rPr>
+              <w:t>web/</w:t>
+            </w:r>
+          </w:p>
+        </w:tc>
+        <w:tc>
+          <w:tcPr>
+            <w:tcW w:type="dxa" w:w="3024"/>
+          </w:tcPr>
+          <w:p>
+            <w:r>
+              <w:rPr>
+                <w:rFonts w:ascii="Times New Roman" w:hAnsi="Times New Roman" w:cs="Times New Roman" w:eastAsia="Times New Roman"/>
+                <w:sz w:val="26"/>
+              </w:rPr>
+            </w:r>
+            <w:r>
+              <w:rPr>
+                <w:rFonts w:ascii="Times New Roman" w:hAnsi="Times New Roman" w:cs="Times New Roman" w:eastAsia="Times New Roman"/>
+                <w:sz w:val="20"/>
+              </w:rPr>
+              <w:t>HTML/CSS/JavaScript thuần + ArcGIS SDK</w:t>
+            </w:r>
+          </w:p>
+        </w:tc>
+        <w:tc>
+          <w:tcPr>
+            <w:tcW w:type="dxa" w:w="4176"/>
+          </w:tcPr>
+          <w:p>
+            <w:r>
+              <w:rPr>
+                <w:rFonts w:ascii="Times New Roman" w:hAnsi="Times New Roman" w:cs="Times New Roman" w:eastAsia="Times New Roman"/>
+                <w:sz w:val="26"/>
+              </w:rPr>
+            </w:r>
+            <w:r>
+              <w:rPr>
+                <w:rFonts w:ascii="Times New Roman" w:hAnsi="Times New Roman" w:cs="Times New Roman" w:eastAsia="Times New Roman"/>
+                <w:sz w:val="20"/>
+              </w:rPr>
+              <w:t>Đăng nhập, chấm công, lịch sử, bảng điều khiển, bản đồ ba chiều</w:t>
+            </w:r>
+          </w:p>
+        </w:tc>
+      </w:tr>
+      <w:tr>
+        <w:tc>
+          <w:tcPr>
+            <w:tcW w:type="dxa" w:w="1584"/>
+          </w:tcPr>
+          <w:p>
+            <w:r>
+              <w:rPr>
+                <w:rFonts w:ascii="Times New Roman" w:hAnsi="Times New Roman" w:cs="Times New Roman" w:eastAsia="Times New Roman"/>
+                <w:sz w:val="26"/>
+              </w:rPr>
+            </w:r>
+            <w:r>
+              <w:rPr>
+                <w:rFonts w:ascii="Times New Roman" w:hAnsi="Times New Roman" w:cs="Times New Roman" w:eastAsia="Times New Roman"/>
+                <w:sz w:val="20"/>
+              </w:rPr>
+              <w:t>db/</w:t>
+            </w:r>
+          </w:p>
+        </w:tc>
+        <w:tc>
+          <w:tcPr>
+            <w:tcW w:type="dxa" w:w="3024"/>
+          </w:tcPr>
+          <w:p>
+            <w:r>
+              <w:rPr>
+                <w:rFonts w:ascii="Times New Roman" w:hAnsi="Times New Roman" w:cs="Times New Roman" w:eastAsia="Times New Roman"/>
+                <w:sz w:val="26"/>
+              </w:rPr>
+            </w:r>
+            <w:r>
+              <w:rPr>
+                <w:rFonts w:ascii="Times New Roman" w:hAnsi="Times New Roman" w:cs="Times New Roman" w:eastAsia="Times New Roman"/>
+                <w:sz w:val="20"/>
+              </w:rPr>
+              <w:t>PostgreSQL 17.6 + PostGIS 3.6.2</w:t>
+            </w:r>
+          </w:p>
+        </w:tc>
+        <w:tc>
+          <w:tcPr>
+            <w:tcW w:type="dxa" w:w="4176"/>
+          </w:tcPr>
+          <w:p>
+            <w:r>
+              <w:rPr>
+                <w:rFonts w:ascii="Times New Roman" w:hAnsi="Times New Roman" w:cs="Times New Roman" w:eastAsia="Times New Roman"/>
+                <w:sz w:val="26"/>
+              </w:rPr>
+            </w:r>
+            <w:r>
+              <w:rPr>
+                <w:rFonts w:ascii="Times New Roman" w:hAnsi="Times New Roman" w:cs="Times New Roman" w:eastAsia="Times New Roman"/>
+                <w:sz w:val="20"/>
+              </w:rPr>
+              <w:t>15 bảng, 4 hàm, 1 trigger; chứa toàn bộ logic không gian</w:t>
+            </w:r>
+          </w:p>
+        </w:tc>
+      </w:tr>
+    </w:tbl>
+    <w:p/>
+    <w:p>
+      <w:pPr>
+        <w:numPr>
+          <w:ilvl w:val="0"/>
+          <w:numId w:val="0"/>
+        </w:numPr>
+        <w:pStyle w:val="Heading3"/>
+      </w:pPr>
+      <w:r>
+        <w:rPr>
+          <w:rFonts w:ascii="Times New Roman" w:hAnsi="Times New Roman" w:cs="Times New Roman" w:eastAsia="Times New Roman"/>
+        </w:rPr>
+        <w:t>3.9.1</w:t>
+        <w:tab/>
+        <w:t>Danh sách điểm cuối API</w:t>
+      </w:r>
+    </w:p>
+    <w:p>
+      <w:pPr>
+        <w:jc w:val="center"/>
+      </w:pPr>
+      <w:r>
+        <w:rPr>
+          <w:rFonts w:ascii="Times New Roman" w:hAnsi="Times New Roman" w:cs="Times New Roman" w:eastAsia="Times New Roman"/>
+          <w:b w:val="0"/>
+          <w:i/>
+          <w:sz w:val="20"/>
+        </w:rPr>
+        <w:t>Bảng 3.2 — Các điểm cuối API của hệ thống</w:t>
+      </w:r>
+    </w:p>
+    <w:tbl>
+      <w:tblPr>
+        <w:tblStyle w:val="TableGrid"/>
+        <w:tblW w:type="auto" w:w="0"/>
+        <w:tblLook w:firstColumn="1" w:firstRow="1" w:lastColumn="0" w:lastRow="0" w:noHBand="0" w:noVBand="1" w:val="04A0"/>
+      </w:tblPr>
+      <w:tblGrid>
+        <w:gridCol w:w="2268"/>
+        <w:gridCol w:w="2268"/>
+        <w:gridCol w:w="2268"/>
+        <w:gridCol w:w="2268"/>
+      </w:tblGrid>
+      <w:tr>
+        <w:tc>
+          <w:tcPr>
+            <w:tcW w:type="dxa" w:w="1224"/>
+          </w:tcPr>
+          <w:p>
+            <w:r>
+              <w:rPr>
+                <w:rFonts w:ascii="Times New Roman" w:hAnsi="Times New Roman" w:cs="Times New Roman" w:eastAsia="Times New Roman"/>
+                <w:sz w:val="26"/>
+              </w:rPr>
+            </w:r>
+            <w:r>
+              <w:rPr>
+                <w:rFonts w:ascii="Times New Roman" w:hAnsi="Times New Roman" w:cs="Times New Roman" w:eastAsia="Times New Roman"/>
+                <w:b/>
+                <w:sz w:val="20"/>
+              </w:rPr>
+              <w:t>Phương thức</w:t>
+            </w:r>
+          </w:p>
+        </w:tc>
+        <w:tc>
+          <w:tcPr>
+            <w:tcW w:type="dxa" w:w="2304"/>
+          </w:tcPr>
+          <w:p>
+            <w:r>
+              <w:rPr>
+                <w:rFonts w:ascii="Times New Roman" w:hAnsi="Times New Roman" w:cs="Times New Roman" w:eastAsia="Times New Roman"/>
+                <w:sz w:val="26"/>
+              </w:rPr>
+            </w:r>
+            <w:r>
+              <w:rPr>
+                <w:rFonts w:ascii="Times New Roman" w:hAnsi="Times New Roman" w:cs="Times New Roman" w:eastAsia="Times New Roman"/>
+                <w:b/>
+                <w:sz w:val="20"/>
+              </w:rPr>
+              <w:t>Đường dẫn</w:t>
+            </w:r>
+          </w:p>
+        </w:tc>
+        <w:tc>
+          <w:tcPr>
+            <w:tcW w:type="dxa" w:w="1368"/>
+          </w:tcPr>
+          <w:p>
+            <w:r>
+              <w:rPr>
+                <w:rFonts w:ascii="Times New Roman" w:hAnsi="Times New Roman" w:cs="Times New Roman" w:eastAsia="Times New Roman"/>
+                <w:sz w:val="26"/>
+              </w:rPr>
+            </w:r>
+            <w:r>
+              <w:rPr>
+                <w:rFonts w:ascii="Times New Roman" w:hAnsi="Times New Roman" w:cs="Times New Roman" w:eastAsia="Times New Roman"/>
+                <w:b/>
+                <w:sz w:val="20"/>
+              </w:rPr>
+              <w:t>Quyền</w:t>
+            </w:r>
+          </w:p>
+        </w:tc>
+        <w:tc>
+          <w:tcPr>
+            <w:tcW w:type="dxa" w:w="3888"/>
+          </w:tcPr>
+          <w:p>
+            <w:r>
+              <w:rPr>
+                <w:rFonts w:ascii="Times New Roman" w:hAnsi="Times New Roman" w:cs="Times New Roman" w:eastAsia="Times New Roman"/>
+                <w:sz w:val="26"/>
+              </w:rPr>
+            </w:r>
+            <w:r>
+              <w:rPr>
+                <w:rFonts w:ascii="Times New Roman" w:hAnsi="Times New Roman" w:cs="Times New Roman" w:eastAsia="Times New Roman"/>
+                <w:b/>
+                <w:sz w:val="20"/>
+              </w:rPr>
+              <w:t>Chức năng</w:t>
+            </w:r>
+          </w:p>
+        </w:tc>
+      </w:tr>
+      <w:tr>
+        <w:tc>
+          <w:tcPr>
+            <w:tcW w:type="dxa" w:w="1224"/>
+          </w:tcPr>
+          <w:p>
+            <w:r>
+              <w:rPr>
+                <w:rFonts w:ascii="Times New Roman" w:hAnsi="Times New Roman" w:cs="Times New Roman" w:eastAsia="Times New Roman"/>
+                <w:sz w:val="26"/>
+              </w:rPr>
+            </w:r>
+            <w:r>
+              <w:rPr>
+                <w:rFonts w:ascii="Times New Roman" w:hAnsi="Times New Roman" w:cs="Times New Roman" w:eastAsia="Times New Roman"/>
+                <w:sz w:val="20"/>
+              </w:rPr>
+              <w:t>POST</w:t>
+            </w:r>
+          </w:p>
+        </w:tc>
+        <w:tc>
+          <w:tcPr>
+            <w:tcW w:type="dxa" w:w="2304"/>
+          </w:tcPr>
+          <w:p>
+            <w:r>
+              <w:rPr>
+                <w:rFonts w:ascii="Times New Roman" w:hAnsi="Times New Roman" w:cs="Times New Roman" w:eastAsia="Times New Roman"/>
+                <w:sz w:val="26"/>
+              </w:rPr>
+            </w:r>
+            <w:r>
+              <w:rPr>
+                <w:rFonts w:ascii="Times New Roman" w:hAnsi="Times New Roman" w:cs="Times New Roman" w:eastAsia="Times New Roman"/>
+                <w:sz w:val="20"/>
+              </w:rPr>
+              <w:t>/api/dang-nhap</w:t>
+            </w:r>
+          </w:p>
+        </w:tc>
+        <w:tc>
+          <w:tcPr>
+            <w:tcW w:type="dxa" w:w="1368"/>
+          </w:tcPr>
+          <w:p>
+            <w:r>
+              <w:rPr>
+                <w:rFonts w:ascii="Times New Roman" w:hAnsi="Times New Roman" w:cs="Times New Roman" w:eastAsia="Times New Roman"/>
+                <w:sz w:val="26"/>
+              </w:rPr>
+            </w:r>
+            <w:r>
+              <w:rPr>
+                <w:rFonts w:ascii="Times New Roman" w:hAnsi="Times New Roman" w:cs="Times New Roman" w:eastAsia="Times New Roman"/>
+                <w:sz w:val="20"/>
+              </w:rPr>
+              <w:t>—</w:t>
+            </w:r>
+          </w:p>
+        </w:tc>
+        <w:tc>
+          <w:tcPr>
+            <w:tcW w:type="dxa" w:w="3888"/>
+          </w:tcPr>
+          <w:p>
+            <w:r>
+              <w:rPr>
+                <w:rFonts w:ascii="Times New Roman" w:hAnsi="Times New Roman" w:cs="Times New Roman" w:eastAsia="Times New Roman"/>
+                <w:sz w:val="26"/>
+              </w:rPr>
+            </w:r>
+            <w:r>
+              <w:rPr>
+                <w:rFonts w:ascii="Times New Roman" w:hAnsi="Times New Roman" w:cs="Times New Roman" w:eastAsia="Times New Roman"/>
+                <w:sz w:val="20"/>
+              </w:rPr>
+              <w:t>Đăng nhập, trả về JWT</w:t>
+            </w:r>
+          </w:p>
+        </w:tc>
+      </w:tr>
+      <w:tr>
+        <w:tc>
+          <w:tcPr>
+            <w:tcW w:type="dxa" w:w="1224"/>
+          </w:tcPr>
+          <w:p>
+            <w:r>
+              <w:rPr>
+                <w:rFonts w:ascii="Times New Roman" w:hAnsi="Times New Roman" w:cs="Times New Roman" w:eastAsia="Times New Roman"/>
+                <w:sz w:val="26"/>
+              </w:rPr>
+            </w:r>
+            <w:r>
+              <w:rPr>
+                <w:rFonts w:ascii="Times New Roman" w:hAnsi="Times New Roman" w:cs="Times New Roman" w:eastAsia="Times New Roman"/>
+                <w:sz w:val="20"/>
+              </w:rPr>
+              <w:t>GET</w:t>
+            </w:r>
+          </w:p>
+        </w:tc>
+        <w:tc>
+          <w:tcPr>
+            <w:tcW w:type="dxa" w:w="2304"/>
+          </w:tcPr>
+          <w:p>
+            <w:r>
+              <w:rPr>
+                <w:rFonts w:ascii="Times New Roman" w:hAnsi="Times New Roman" w:cs="Times New Roman" w:eastAsia="Times New Roman"/>
+                <w:sz w:val="26"/>
+              </w:rPr>
+            </w:r>
+            <w:r>
+              <w:rPr>
+                <w:rFonts w:ascii="Times New Roman" w:hAnsi="Times New Roman" w:cs="Times New Roman" w:eastAsia="Times New Roman"/>
+                <w:sz w:val="20"/>
+              </w:rPr>
+              <w:t>/api/toi</w:t>
+            </w:r>
+          </w:p>
+        </w:tc>
+        <w:tc>
+          <w:tcPr>
+            <w:tcW w:type="dxa" w:w="1368"/>
+          </w:tcPr>
+          <w:p>
+            <w:r>
+              <w:rPr>
+                <w:rFonts w:ascii="Times New Roman" w:hAnsi="Times New Roman" w:cs="Times New Roman" w:eastAsia="Times New Roman"/>
+                <w:sz w:val="26"/>
+              </w:rPr>
+            </w:r>
+            <w:r>
+              <w:rPr>
+                <w:rFonts w:ascii="Times New Roman" w:hAnsi="Times New Roman" w:cs="Times New Roman" w:eastAsia="Times New Roman"/>
+                <w:sz w:val="20"/>
+              </w:rPr>
+              <w:t>đã đăng nhập</w:t>
+            </w:r>
+          </w:p>
+        </w:tc>
+        <w:tc>
+          <w:tcPr>
+            <w:tcW w:type="dxa" w:w="3888"/>
+          </w:tcPr>
+          <w:p>
+            <w:r>
+              <w:rPr>
+                <w:rFonts w:ascii="Times New Roman" w:hAnsi="Times New Roman" w:cs="Times New Roman" w:eastAsia="Times New Roman"/>
+                <w:sz w:val="26"/>
+              </w:rPr>
+            </w:r>
+            <w:r>
+              <w:rPr>
+                <w:rFonts w:ascii="Times New Roman" w:hAnsi="Times New Roman" w:cs="Times New Roman" w:eastAsia="Times New Roman"/>
+                <w:sz w:val="20"/>
+              </w:rPr>
+              <w:t>Thông tin nhân viên và khối MAP của họ</w:t>
+            </w:r>
+          </w:p>
+        </w:tc>
+      </w:tr>
+      <w:tr>
+        <w:tc>
+          <w:tcPr>
+            <w:tcW w:type="dxa" w:w="1224"/>
+          </w:tcPr>
+          <w:p>
+            <w:r>
+              <w:rPr>
+                <w:rFonts w:ascii="Times New Roman" w:hAnsi="Times New Roman" w:cs="Times New Roman" w:eastAsia="Times New Roman"/>
+                <w:sz w:val="26"/>
+              </w:rPr>
+            </w:r>
+            <w:r>
+              <w:rPr>
+                <w:rFonts w:ascii="Times New Roman" w:hAnsi="Times New Roman" w:cs="Times New Roman" w:eastAsia="Times New Roman"/>
+                <w:sz w:val="20"/>
+              </w:rPr>
+              <w:t>GET</w:t>
+            </w:r>
+          </w:p>
+        </w:tc>
+        <w:tc>
+          <w:tcPr>
+            <w:tcW w:type="dxa" w:w="2304"/>
+          </w:tcPr>
+          <w:p>
+            <w:r>
+              <w:rPr>
+                <w:rFonts w:ascii="Times New Roman" w:hAnsi="Times New Roman" w:cs="Times New Roman" w:eastAsia="Times New Roman"/>
+                <w:sz w:val="26"/>
+              </w:rPr>
+            </w:r>
+            <w:r>
+              <w:rPr>
+                <w:rFonts w:ascii="Times New Roman" w:hAnsi="Times New Roman" w:cs="Times New Roman" w:eastAsia="Times New Roman"/>
+                <w:sz w:val="20"/>
+              </w:rPr>
+              <w:t>/api/khu-vuc</w:t>
+            </w:r>
+          </w:p>
+        </w:tc>
+        <w:tc>
+          <w:tcPr>
+            <w:tcW w:type="dxa" w:w="1368"/>
+          </w:tcPr>
+          <w:p>
+            <w:r>
+              <w:rPr>
+                <w:rFonts w:ascii="Times New Roman" w:hAnsi="Times New Roman" w:cs="Times New Roman" w:eastAsia="Times New Roman"/>
+                <w:sz w:val="26"/>
+              </w:rPr>
+            </w:r>
+            <w:r>
+              <w:rPr>
+                <w:rFonts w:ascii="Times New Roman" w:hAnsi="Times New Roman" w:cs="Times New Roman" w:eastAsia="Times New Roman"/>
+                <w:sz w:val="20"/>
+              </w:rPr>
+              <w:t>đã đăng nhập</w:t>
+            </w:r>
+          </w:p>
+        </w:tc>
+        <w:tc>
+          <w:tcPr>
+            <w:tcW w:type="dxa" w:w="3888"/>
+          </w:tcPr>
+          <w:p>
+            <w:r>
+              <w:rPr>
+                <w:rFonts w:ascii="Times New Roman" w:hAnsi="Times New Roman" w:cs="Times New Roman" w:eastAsia="Times New Roman"/>
+                <w:sz w:val="26"/>
+              </w:rPr>
+            </w:r>
+            <w:r>
+              <w:rPr>
+                <w:rFonts w:ascii="Times New Roman" w:hAnsi="Times New Roman" w:cs="Times New Roman" w:eastAsia="Times New Roman"/>
+                <w:sz w:val="20"/>
+              </w:rPr>
+              <w:t>Danh sách khối MAP để vẽ bản đồ</w:t>
+            </w:r>
+          </w:p>
+        </w:tc>
+      </w:tr>
+      <w:tr>
+        <w:tc>
+          <w:tcPr>
+            <w:tcW w:type="dxa" w:w="1224"/>
+          </w:tcPr>
+          <w:p>
+            <w:r>
+              <w:rPr>
+                <w:rFonts w:ascii="Times New Roman" w:hAnsi="Times New Roman" w:cs="Times New Roman" w:eastAsia="Times New Roman"/>
+                <w:sz w:val="26"/>
+              </w:rPr>
+            </w:r>
+            <w:r>
+              <w:rPr>
+                <w:rFonts w:ascii="Times New Roman" w:hAnsi="Times New Roman" w:cs="Times New Roman" w:eastAsia="Times New Roman"/>
+                <w:sz w:val="20"/>
+              </w:rPr>
+              <w:t>POST</w:t>
+            </w:r>
+          </w:p>
+        </w:tc>
+        <w:tc>
+          <w:tcPr>
+            <w:tcW w:type="dxa" w:w="2304"/>
+          </w:tcPr>
+          <w:p>
+            <w:r>
+              <w:rPr>
+                <w:rFonts w:ascii="Times New Roman" w:hAnsi="Times New Roman" w:cs="Times New Roman" w:eastAsia="Times New Roman"/>
+                <w:sz w:val="26"/>
+              </w:rPr>
+            </w:r>
+            <w:r>
+              <w:rPr>
+                <w:rFonts w:ascii="Times New Roman" w:hAnsi="Times New Roman" w:cs="Times New Roman" w:eastAsia="Times New Roman"/>
+                <w:sz w:val="20"/>
+              </w:rPr>
+              <w:t>/api/cham-cong</w:t>
+            </w:r>
+          </w:p>
+        </w:tc>
+        <w:tc>
+          <w:tcPr>
+            <w:tcW w:type="dxa" w:w="1368"/>
+          </w:tcPr>
+          <w:p>
+            <w:r>
+              <w:rPr>
+                <w:rFonts w:ascii="Times New Roman" w:hAnsi="Times New Roman" w:cs="Times New Roman" w:eastAsia="Times New Roman"/>
+                <w:sz w:val="26"/>
+              </w:rPr>
+            </w:r>
+            <w:r>
+              <w:rPr>
+                <w:rFonts w:ascii="Times New Roman" w:hAnsi="Times New Roman" w:cs="Times New Roman" w:eastAsia="Times New Roman"/>
+                <w:sz w:val="20"/>
+              </w:rPr>
+              <w:t>đã đăng nhập</w:t>
+            </w:r>
+          </w:p>
+        </w:tc>
+        <w:tc>
+          <w:tcPr>
+            <w:tcW w:type="dxa" w:w="3888"/>
+          </w:tcPr>
+          <w:p>
+            <w:r>
+              <w:rPr>
+                <w:rFonts w:ascii="Times New Roman" w:hAnsi="Times New Roman" w:cs="Times New Roman" w:eastAsia="Times New Roman"/>
+                <w:sz w:val="26"/>
+              </w:rPr>
+            </w:r>
+            <w:r>
+              <w:rPr>
+                <w:rFonts w:ascii="Times New Roman" w:hAnsi="Times New Roman" w:cs="Times New Roman" w:eastAsia="Times New Roman"/>
+                <w:sz w:val="20"/>
+              </w:rPr>
+              <w:t>Kiểm tra bao hàm khối, áp R1–R4, ghi bản ghi và cảnh báo</w:t>
+            </w:r>
+          </w:p>
+        </w:tc>
+      </w:tr>
+      <w:tr>
+        <w:tc>
+          <w:tcPr>
+            <w:tcW w:type="dxa" w:w="1224"/>
+          </w:tcPr>
+          <w:p>
+            <w:r>
+              <w:rPr>
+                <w:rFonts w:ascii="Times New Roman" w:hAnsi="Times New Roman" w:cs="Times New Roman" w:eastAsia="Times New Roman"/>
+                <w:sz w:val="26"/>
+              </w:rPr>
+            </w:r>
+            <w:r>
+              <w:rPr>
+                <w:rFonts w:ascii="Times New Roman" w:hAnsi="Times New Roman" w:cs="Times New Roman" w:eastAsia="Times New Roman"/>
+                <w:sz w:val="20"/>
+              </w:rPr>
+              <w:t>GET</w:t>
+            </w:r>
+          </w:p>
+        </w:tc>
+        <w:tc>
+          <w:tcPr>
+            <w:tcW w:type="dxa" w:w="2304"/>
+          </w:tcPr>
+          <w:p>
+            <w:r>
+              <w:rPr>
+                <w:rFonts w:ascii="Times New Roman" w:hAnsi="Times New Roman" w:cs="Times New Roman" w:eastAsia="Times New Roman"/>
+                <w:sz w:val="26"/>
+              </w:rPr>
+            </w:r>
+            <w:r>
+              <w:rPr>
+                <w:rFonts w:ascii="Times New Roman" w:hAnsi="Times New Roman" w:cs="Times New Roman" w:eastAsia="Times New Roman"/>
+                <w:sz w:val="20"/>
+              </w:rPr>
+              <w:t>/api/cham-cong/lich-su</w:t>
+            </w:r>
+          </w:p>
+        </w:tc>
+        <w:tc>
+          <w:tcPr>
+            <w:tcW w:type="dxa" w:w="1368"/>
+          </w:tcPr>
+          <w:p>
+            <w:r>
+              <w:rPr>
+                <w:rFonts w:ascii="Times New Roman" w:hAnsi="Times New Roman" w:cs="Times New Roman" w:eastAsia="Times New Roman"/>
+                <w:sz w:val="26"/>
+              </w:rPr>
+            </w:r>
+            <w:r>
+              <w:rPr>
+                <w:rFonts w:ascii="Times New Roman" w:hAnsi="Times New Roman" w:cs="Times New Roman" w:eastAsia="Times New Roman"/>
+                <w:sz w:val="20"/>
+              </w:rPr>
+              <w:t>đã đăng nhập</w:t>
+            </w:r>
+          </w:p>
+        </w:tc>
+        <w:tc>
+          <w:tcPr>
+            <w:tcW w:type="dxa" w:w="3888"/>
+          </w:tcPr>
+          <w:p>
+            <w:r>
+              <w:rPr>
+                <w:rFonts w:ascii="Times New Roman" w:hAnsi="Times New Roman" w:cs="Times New Roman" w:eastAsia="Times New Roman"/>
+                <w:sz w:val="26"/>
+              </w:rPr>
+            </w:r>
+            <w:r>
+              <w:rPr>
+                <w:rFonts w:ascii="Times New Roman" w:hAnsi="Times New Roman" w:cs="Times New Roman" w:eastAsia="Times New Roman"/>
+                <w:sz w:val="20"/>
+              </w:rPr>
+              <w:t>Lịch sử của chính mình</w:t>
+            </w:r>
+          </w:p>
+        </w:tc>
+      </w:tr>
+      <w:tr>
+        <w:tc>
+          <w:tcPr>
+            <w:tcW w:type="dxa" w:w="1224"/>
+          </w:tcPr>
+          <w:p>
+            <w:r>
+              <w:rPr>
+                <w:rFonts w:ascii="Times New Roman" w:hAnsi="Times New Roman" w:cs="Times New Roman" w:eastAsia="Times New Roman"/>
+                <w:sz w:val="26"/>
+              </w:rPr>
+            </w:r>
+            <w:r>
+              <w:rPr>
+                <w:rFonts w:ascii="Times New Roman" w:hAnsi="Times New Roman" w:cs="Times New Roman" w:eastAsia="Times New Roman"/>
+                <w:sz w:val="20"/>
+              </w:rPr>
+              <w:t>POST</w:t>
+            </w:r>
+          </w:p>
+        </w:tc>
+        <w:tc>
+          <w:tcPr>
+            <w:tcW w:type="dxa" w:w="2304"/>
+          </w:tcPr>
+          <w:p>
+            <w:r>
+              <w:rPr>
+                <w:rFonts w:ascii="Times New Roman" w:hAnsi="Times New Roman" w:cs="Times New Roman" w:eastAsia="Times New Roman"/>
+                <w:sz w:val="26"/>
+              </w:rPr>
+            </w:r>
+            <w:r>
+              <w:rPr>
+                <w:rFonts w:ascii="Times New Roman" w:hAnsi="Times New Roman" w:cs="Times New Roman" w:eastAsia="Times New Roman"/>
+                <w:sz w:val="20"/>
+              </w:rPr>
+              <w:t>/api/giai-trinh</w:t>
+            </w:r>
+          </w:p>
+        </w:tc>
+        <w:tc>
+          <w:tcPr>
+            <w:tcW w:type="dxa" w:w="1368"/>
+          </w:tcPr>
+          <w:p>
+            <w:r>
+              <w:rPr>
+                <w:rFonts w:ascii="Times New Roman" w:hAnsi="Times New Roman" w:cs="Times New Roman" w:eastAsia="Times New Roman"/>
+                <w:sz w:val="26"/>
+              </w:rPr>
+            </w:r>
+            <w:r>
+              <w:rPr>
+                <w:rFonts w:ascii="Times New Roman" w:hAnsi="Times New Roman" w:cs="Times New Roman" w:eastAsia="Times New Roman"/>
+                <w:sz w:val="20"/>
+              </w:rPr>
+              <w:t>đã đăng nhập</w:t>
+            </w:r>
+          </w:p>
+        </w:tc>
+        <w:tc>
+          <w:tcPr>
+            <w:tcW w:type="dxa" w:w="3888"/>
+          </w:tcPr>
+          <w:p>
+            <w:r>
+              <w:rPr>
+                <w:rFonts w:ascii="Times New Roman" w:hAnsi="Times New Roman" w:cs="Times New Roman" w:eastAsia="Times New Roman"/>
+                <w:sz w:val="26"/>
+              </w:rPr>
+            </w:r>
+            <w:r>
+              <w:rPr>
+                <w:rFonts w:ascii="Times New Roman" w:hAnsi="Times New Roman" w:cs="Times New Roman" w:eastAsia="Times New Roman"/>
+                <w:sz w:val="20"/>
+              </w:rPr>
+              <w:t>Gửi đơn giải trình</w:t>
+            </w:r>
+          </w:p>
+        </w:tc>
+      </w:tr>
+      <w:tr>
+        <w:tc>
+          <w:tcPr>
+            <w:tcW w:type="dxa" w:w="1224"/>
+          </w:tcPr>
+          <w:p>
+            <w:r>
+              <w:rPr>
+                <w:rFonts w:ascii="Times New Roman" w:hAnsi="Times New Roman" w:cs="Times New Roman" w:eastAsia="Times New Roman"/>
+                <w:sz w:val="26"/>
+              </w:rPr>
+            </w:r>
+            <w:r>
+              <w:rPr>
+                <w:rFonts w:ascii="Times New Roman" w:hAnsi="Times New Roman" w:cs="Times New Roman" w:eastAsia="Times New Roman"/>
+                <w:sz w:val="20"/>
+              </w:rPr>
+              <w:t>GET</w:t>
+            </w:r>
+          </w:p>
+        </w:tc>
+        <w:tc>
+          <w:tcPr>
+            <w:tcW w:type="dxa" w:w="2304"/>
+          </w:tcPr>
+          <w:p>
+            <w:r>
+              <w:rPr>
+                <w:rFonts w:ascii="Times New Roman" w:hAnsi="Times New Roman" w:cs="Times New Roman" w:eastAsia="Times New Roman"/>
+                <w:sz w:val="26"/>
+              </w:rPr>
+            </w:r>
+            <w:r>
+              <w:rPr>
+                <w:rFonts w:ascii="Times New Roman" w:hAnsi="Times New Roman" w:cs="Times New Roman" w:eastAsia="Times New Roman"/>
+                <w:sz w:val="20"/>
+              </w:rPr>
+              <w:t>/api/giai-trinh</w:t>
+            </w:r>
+          </w:p>
+        </w:tc>
+        <w:tc>
+          <w:tcPr>
+            <w:tcW w:type="dxa" w:w="1368"/>
+          </w:tcPr>
+          <w:p>
+            <w:r>
+              <w:rPr>
+                <w:rFonts w:ascii="Times New Roman" w:hAnsi="Times New Roman" w:cs="Times New Roman" w:eastAsia="Times New Roman"/>
+                <w:sz w:val="26"/>
+              </w:rPr>
+            </w:r>
+            <w:r>
+              <w:rPr>
+                <w:rFonts w:ascii="Times New Roman" w:hAnsi="Times New Roman" w:cs="Times New Roman" w:eastAsia="Times New Roman"/>
+                <w:sz w:val="20"/>
+              </w:rPr>
+              <w:t>quản lý</w:t>
+            </w:r>
+          </w:p>
+        </w:tc>
+        <w:tc>
+          <w:tcPr>
+            <w:tcW w:type="dxa" w:w="3888"/>
+          </w:tcPr>
+          <w:p>
+            <w:r>
+              <w:rPr>
+                <w:rFonts w:ascii="Times New Roman" w:hAnsi="Times New Roman" w:cs="Times New Roman" w:eastAsia="Times New Roman"/>
+                <w:sz w:val="26"/>
+              </w:rPr>
+            </w:r>
+            <w:r>
+              <w:rPr>
+                <w:rFonts w:ascii="Times New Roman" w:hAnsi="Times New Roman" w:cs="Times New Roman" w:eastAsia="Times New Roman"/>
+                <w:sz w:val="20"/>
+              </w:rPr>
+              <w:t>Danh sách đơn</w:t>
+            </w:r>
+          </w:p>
+        </w:tc>
+      </w:tr>
+      <w:tr>
+        <w:tc>
+          <w:tcPr>
+            <w:tcW w:type="dxa" w:w="1224"/>
+          </w:tcPr>
+          <w:p>
+            <w:r>
+              <w:rPr>
+                <w:rFonts w:ascii="Times New Roman" w:hAnsi="Times New Roman" w:cs="Times New Roman" w:eastAsia="Times New Roman"/>
+                <w:sz w:val="26"/>
+              </w:rPr>
+            </w:r>
+            <w:r>
+              <w:rPr>
+                <w:rFonts w:ascii="Times New Roman" w:hAnsi="Times New Roman" w:cs="Times New Roman" w:eastAsia="Times New Roman"/>
+                <w:sz w:val="20"/>
+              </w:rPr>
+              <w:t>PUT</w:t>
+            </w:r>
+          </w:p>
+        </w:tc>
+        <w:tc>
+          <w:tcPr>
+            <w:tcW w:type="dxa" w:w="2304"/>
+          </w:tcPr>
+          <w:p>
+            <w:r>
+              <w:rPr>
+                <w:rFonts w:ascii="Times New Roman" w:hAnsi="Times New Roman" w:cs="Times New Roman" w:eastAsia="Times New Roman"/>
+                <w:sz w:val="26"/>
+              </w:rPr>
+            </w:r>
+            <w:r>
+              <w:rPr>
+                <w:rFonts w:ascii="Times New Roman" w:hAnsi="Times New Roman" w:cs="Times New Roman" w:eastAsia="Times New Roman"/>
+                <w:sz w:val="20"/>
+              </w:rPr>
+              <w:t>/api/giai-trinh/:id</w:t>
+            </w:r>
+          </w:p>
+        </w:tc>
+        <w:tc>
+          <w:tcPr>
+            <w:tcW w:type="dxa" w:w="1368"/>
+          </w:tcPr>
+          <w:p>
+            <w:r>
+              <w:rPr>
+                <w:rFonts w:ascii="Times New Roman" w:hAnsi="Times New Roman" w:cs="Times New Roman" w:eastAsia="Times New Roman"/>
+                <w:sz w:val="26"/>
+              </w:rPr>
+            </w:r>
+            <w:r>
+              <w:rPr>
+                <w:rFonts w:ascii="Times New Roman" w:hAnsi="Times New Roman" w:cs="Times New Roman" w:eastAsia="Times New Roman"/>
+                <w:sz w:val="20"/>
+              </w:rPr>
+              <w:t>quản lý</w:t>
+            </w:r>
+          </w:p>
+        </w:tc>
+        <w:tc>
+          <w:tcPr>
+            <w:tcW w:type="dxa" w:w="3888"/>
+          </w:tcPr>
+          <w:p>
+            <w:r>
+              <w:rPr>
+                <w:rFonts w:ascii="Times New Roman" w:hAnsi="Times New Roman" w:cs="Times New Roman" w:eastAsia="Times New Roman"/>
+                <w:sz w:val="26"/>
+              </w:rPr>
+            </w:r>
+            <w:r>
+              <w:rPr>
+                <w:rFonts w:ascii="Times New Roman" w:hAnsi="Times New Roman" w:cs="Times New Roman" w:eastAsia="Times New Roman"/>
+                <w:sz w:val="20"/>
+              </w:rPr>
+              <w:t>Duyệt hoặc từ chối đơn</w:t>
+            </w:r>
+          </w:p>
+        </w:tc>
+      </w:tr>
+      <w:tr>
+        <w:tc>
+          <w:tcPr>
+            <w:tcW w:type="dxa" w:w="1224"/>
+          </w:tcPr>
+          <w:p>
+            <w:r>
+              <w:rPr>
+                <w:rFonts w:ascii="Times New Roman" w:hAnsi="Times New Roman" w:cs="Times New Roman" w:eastAsia="Times New Roman"/>
+                <w:sz w:val="26"/>
+              </w:rPr>
+            </w:r>
+            <w:r>
+              <w:rPr>
+                <w:rFonts w:ascii="Times New Roman" w:hAnsi="Times New Roman" w:cs="Times New Roman" w:eastAsia="Times New Roman"/>
+                <w:sz w:val="20"/>
+              </w:rPr>
+              <w:t>GET</w:t>
+            </w:r>
+          </w:p>
+        </w:tc>
+        <w:tc>
+          <w:tcPr>
+            <w:tcW w:type="dxa" w:w="2304"/>
+          </w:tcPr>
+          <w:p>
+            <w:r>
+              <w:rPr>
+                <w:rFonts w:ascii="Times New Roman" w:hAnsi="Times New Roman" w:cs="Times New Roman" w:eastAsia="Times New Roman"/>
+                <w:sz w:val="26"/>
+              </w:rPr>
+            </w:r>
+            <w:r>
+              <w:rPr>
+                <w:rFonts w:ascii="Times New Roman" w:hAnsi="Times New Roman" w:cs="Times New Roman" w:eastAsia="Times New Roman"/>
+                <w:sz w:val="20"/>
+              </w:rPr>
+              <w:t>/api/canh-bao</w:t>
+            </w:r>
+          </w:p>
+        </w:tc>
+        <w:tc>
+          <w:tcPr>
+            <w:tcW w:type="dxa" w:w="1368"/>
+          </w:tcPr>
+          <w:p>
+            <w:r>
+              <w:rPr>
+                <w:rFonts w:ascii="Times New Roman" w:hAnsi="Times New Roman" w:cs="Times New Roman" w:eastAsia="Times New Roman"/>
+                <w:sz w:val="26"/>
+              </w:rPr>
+            </w:r>
+            <w:r>
+              <w:rPr>
+                <w:rFonts w:ascii="Times New Roman" w:hAnsi="Times New Roman" w:cs="Times New Roman" w:eastAsia="Times New Roman"/>
+                <w:sz w:val="20"/>
+              </w:rPr>
+              <w:t>quản lý</w:t>
+            </w:r>
+          </w:p>
+        </w:tc>
+        <w:tc>
+          <w:tcPr>
+            <w:tcW w:type="dxa" w:w="3888"/>
+          </w:tcPr>
+          <w:p>
+            <w:r>
+              <w:rPr>
+                <w:rFonts w:ascii="Times New Roman" w:hAnsi="Times New Roman" w:cs="Times New Roman" w:eastAsia="Times New Roman"/>
+                <w:sz w:val="26"/>
+              </w:rPr>
+            </w:r>
+            <w:r>
+              <w:rPr>
+                <w:rFonts w:ascii="Times New Roman" w:hAnsi="Times New Roman" w:cs="Times New Roman" w:eastAsia="Times New Roman"/>
+                <w:sz w:val="20"/>
+              </w:rPr>
+              <w:t>Danh sách cảnh báo bất thường</w:t>
+            </w:r>
+          </w:p>
+        </w:tc>
+      </w:tr>
+      <w:tr>
+        <w:tc>
+          <w:tcPr>
+            <w:tcW w:type="dxa" w:w="1224"/>
+          </w:tcPr>
+          <w:p>
+            <w:r>
+              <w:rPr>
+                <w:rFonts w:ascii="Times New Roman" w:hAnsi="Times New Roman" w:cs="Times New Roman" w:eastAsia="Times New Roman"/>
+                <w:sz w:val="26"/>
+              </w:rPr>
+            </w:r>
+            <w:r>
+              <w:rPr>
+                <w:rFonts w:ascii="Times New Roman" w:hAnsi="Times New Roman" w:cs="Times New Roman" w:eastAsia="Times New Roman"/>
+                <w:sz w:val="20"/>
+              </w:rPr>
+              <w:t>GET</w:t>
+            </w:r>
+          </w:p>
+        </w:tc>
+        <w:tc>
+          <w:tcPr>
+            <w:tcW w:type="dxa" w:w="2304"/>
+          </w:tcPr>
+          <w:p>
+            <w:r>
+              <w:rPr>
+                <w:rFonts w:ascii="Times New Roman" w:hAnsi="Times New Roman" w:cs="Times New Roman" w:eastAsia="Times New Roman"/>
+                <w:sz w:val="26"/>
+              </w:rPr>
+            </w:r>
+            <w:r>
+              <w:rPr>
+                <w:rFonts w:ascii="Times New Roman" w:hAnsi="Times New Roman" w:cs="Times New Roman" w:eastAsia="Times New Roman"/>
+                <w:sz w:val="20"/>
+              </w:rPr>
+              <w:t>/api/dashboard</w:t>
+            </w:r>
+          </w:p>
+        </w:tc>
+        <w:tc>
+          <w:tcPr>
+            <w:tcW w:type="dxa" w:w="1368"/>
+          </w:tcPr>
+          <w:p>
+            <w:r>
+              <w:rPr>
+                <w:rFonts w:ascii="Times New Roman" w:hAnsi="Times New Roman" w:cs="Times New Roman" w:eastAsia="Times New Roman"/>
+                <w:sz w:val="26"/>
+              </w:rPr>
+            </w:r>
+            <w:r>
+              <w:rPr>
+                <w:rFonts w:ascii="Times New Roman" w:hAnsi="Times New Roman" w:cs="Times New Roman" w:eastAsia="Times New Roman"/>
+                <w:sz w:val="20"/>
+              </w:rPr>
+              <w:t>quản lý</w:t>
+            </w:r>
+          </w:p>
+        </w:tc>
+        <w:tc>
+          <w:tcPr>
+            <w:tcW w:type="dxa" w:w="3888"/>
+          </w:tcPr>
+          <w:p>
+            <w:r>
+              <w:rPr>
+                <w:rFonts w:ascii="Times New Roman" w:hAnsi="Times New Roman" w:cs="Times New Roman" w:eastAsia="Times New Roman"/>
+                <w:sz w:val="26"/>
+              </w:rPr>
+            </w:r>
+            <w:r>
+              <w:rPr>
+                <w:rFonts w:ascii="Times New Roman" w:hAnsi="Times New Roman" w:cs="Times New Roman" w:eastAsia="Times New Roman"/>
+                <w:sz w:val="20"/>
+              </w:rPr>
+              <w:t>Số liệu tổng hợp</w:t>
+            </w:r>
+          </w:p>
+        </w:tc>
+      </w:tr>
+      <w:tr>
+        <w:tc>
+          <w:tcPr>
+            <w:tcW w:type="dxa" w:w="1224"/>
+          </w:tcPr>
+          <w:p>
+            <w:r>
+              <w:rPr>
+                <w:rFonts w:ascii="Times New Roman" w:hAnsi="Times New Roman" w:cs="Times New Roman" w:eastAsia="Times New Roman"/>
+                <w:sz w:val="26"/>
+              </w:rPr>
+            </w:r>
+            <w:r>
+              <w:rPr>
+                <w:rFonts w:ascii="Times New Roman" w:hAnsi="Times New Roman" w:cs="Times New Roman" w:eastAsia="Times New Roman"/>
+                <w:sz w:val="20"/>
+              </w:rPr>
+              <w:t>GET</w:t>
+            </w:r>
+          </w:p>
+        </w:tc>
+        <w:tc>
+          <w:tcPr>
+            <w:tcW w:type="dxa" w:w="2304"/>
+          </w:tcPr>
+          <w:p>
+            <w:r>
+              <w:rPr>
+                <w:rFonts w:ascii="Times New Roman" w:hAnsi="Times New Roman" w:cs="Times New Roman" w:eastAsia="Times New Roman"/>
+                <w:sz w:val="26"/>
+              </w:rPr>
+            </w:r>
+            <w:r>
+              <w:rPr>
+                <w:rFonts w:ascii="Times New Roman" w:hAnsi="Times New Roman" w:cs="Times New Roman" w:eastAsia="Times New Roman"/>
+                <w:sz w:val="20"/>
+              </w:rPr>
+              <w:t>/api/bao-cao/cong</w:t>
+            </w:r>
+          </w:p>
+        </w:tc>
+        <w:tc>
+          <w:tcPr>
+            <w:tcW w:type="dxa" w:w="1368"/>
+          </w:tcPr>
+          <w:p>
+            <w:r>
+              <w:rPr>
+                <w:rFonts w:ascii="Times New Roman" w:hAnsi="Times New Roman" w:cs="Times New Roman" w:eastAsia="Times New Roman"/>
+                <w:sz w:val="26"/>
+              </w:rPr>
+            </w:r>
+            <w:r>
+              <w:rPr>
+                <w:rFonts w:ascii="Times New Roman" w:hAnsi="Times New Roman" w:cs="Times New Roman" w:eastAsia="Times New Roman"/>
+                <w:sz w:val="20"/>
+              </w:rPr>
+              <w:t>quản lý</w:t>
+            </w:r>
+          </w:p>
+        </w:tc>
+        <w:tc>
+          <w:tcPr>
+            <w:tcW w:type="dxa" w:w="3888"/>
+          </w:tcPr>
+          <w:p>
+            <w:r>
+              <w:rPr>
+                <w:rFonts w:ascii="Times New Roman" w:hAnsi="Times New Roman" w:cs="Times New Roman" w:eastAsia="Times New Roman"/>
+                <w:sz w:val="26"/>
+              </w:rPr>
+            </w:r>
+            <w:r>
+              <w:rPr>
+                <w:rFonts w:ascii="Times New Roman" w:hAnsi="Times New Roman" w:cs="Times New Roman" w:eastAsia="Times New Roman"/>
+                <w:sz w:val="20"/>
+              </w:rPr>
+              <w:t>Báo cáo công theo tháng</w:t>
+            </w:r>
+          </w:p>
+        </w:tc>
+      </w:tr>
+    </w:tbl>
+    <w:p/>
+    <w:p>
+      <w:pPr>
+        <w:numPr>
+          <w:ilvl w:val="0"/>
+          <w:numId w:val="0"/>
+        </w:numPr>
+        <w:pStyle w:val="Heading3"/>
+      </w:pPr>
+      <w:r>
+        <w:rPr>
+          <w:rFonts w:ascii="Times New Roman" w:hAnsi="Times New Roman" w:cs="Times New Roman" w:eastAsia="Times New Roman"/>
+        </w:rPr>
+        <w:t>3.9.2</w:t>
+        <w:tab/>
+        <w:t>Giao diện đã cài đặt</w:t>
+      </w:r>
+    </w:p>
+    <w:p>
+      <w:pPr>
+        <w:jc w:val="center"/>
+      </w:pPr>
+      <w:r>
+        <w:rPr>
+          <w:rFonts w:ascii="Times New Roman" w:hAnsi="Times New Roman" w:cs="Times New Roman" w:eastAsia="Times New Roman"/>
+          <w:sz w:val="26"/>
+        </w:rPr>
+        <w:drawing>
+          <wp:inline xmlns:a="http://schemas.openxmlformats.org/drawingml/2006/main" xmlns:pic="http://schemas.openxmlformats.org/drawingml/2006/picture">
+            <wp:extent cx="5486400" cy="2957885"/>
+            <wp:docPr id="9" name="Picture 9"/>
+            <wp:cNvGraphicFramePr>
+              <a:graphicFrameLocks noChangeAspect="1"/>
+            </wp:cNvGraphicFramePr>
+            <a:graphic>
+              <a:graphicData uri="http://schemas.openxmlformats.org/drawingml/2006/picture">
+                <pic:pic>
+                  <pic:nvPicPr>
+                    <pic:cNvPr id="0" name="03-app-cham-cong.png"/>
+                    <pic:cNvPicPr/>
+                  </pic:nvPicPr>
+                  <pic:blipFill>
+                    <a:blip r:embed="rId37"/>
+                    <a:stretch>
+                      <a:fillRect/>
+                    </a:stretch>
+                  </pic:blipFill>
+                  <pic:spPr>
+                    <a:xfrm>
+                      <a:off x="0" y="0"/>
+                      <a:ext cx="5486400" cy="2957885"/>
+                    </a:xfrm>
+                    <a:prstGeom prst="rect"/>
+                  </pic:spPr>
+                </pic:pic>
+              </a:graphicData>
+            </a:graphic>
+          </wp:inline>
+        </w:drawing>
+      </w:r>
+    </w:p>
+    <w:p>
+      <w:pPr>
+        <w:jc w:val="center"/>
+      </w:pPr>
+      <w:r>
+        <w:rPr>
+          <w:rFonts w:ascii="Times New Roman" w:hAnsi="Times New Roman" w:cs="Times New Roman" w:eastAsia="Times New Roman"/>
+          <w:b w:val="0"/>
+          <w:i/>
+          <w:sz w:val="20"/>
+        </w:rPr>
+        <w:t>Hình 3.2 — Màn hình chấm công: thông tin làm việc lấy từ cơ sở dữ liệu, thanh chọn tầng, bản đồ ba chiều hiển thị các khối MAP kèm popup thuộc tính</w:t>
+      </w:r>
+    </w:p>
+    <w:p/>
+    <w:p>
+      <w:pPr>
+        <w:jc w:val="center"/>
+      </w:pPr>
+      <w:r>
+        <w:rPr>
+          <w:rFonts w:ascii="Times New Roman" w:hAnsi="Times New Roman" w:cs="Times New Roman" w:eastAsia="Times New Roman"/>
+          <w:sz w:val="26"/>
+        </w:rPr>
+        <w:drawing>
+          <wp:inline xmlns:a="http://schemas.openxmlformats.org/drawingml/2006/main" xmlns:pic="http://schemas.openxmlformats.org/drawingml/2006/picture">
+            <wp:extent cx="5486400" cy="2957885"/>
+            <wp:docPr id="10" name="Picture 10"/>
+            <wp:cNvGraphicFramePr>
+              <a:graphicFrameLocks noChangeAspect="1"/>
+            </wp:cNvGraphicFramePr>
+            <a:graphic>
+              <a:graphicData uri="http://schemas.openxmlformats.org/drawingml/2006/picture">
+                <pic:pic>
+                  <pic:nvPicPr>
+                    <pic:cNvPr id="0" name="04-app-quan-ly.png"/>
+                    <pic:cNvPicPr/>
+                  </pic:nvPicPr>
+                  <pic:blipFill>
+                    <a:blip r:embed="rId38"/>
+                    <a:stretch>
+                      <a:fillRect/>
+                    </a:stretch>
+                  </pic:blipFill>
+                  <pic:spPr>
+                    <a:xfrm>
+                      <a:off x="0" y="0"/>
+                      <a:ext cx="5486400" cy="2957885"/>
+                    </a:xfrm>
+                    <a:prstGeom prst="rect"/>
+                  </pic:spPr>
+                </pic:pic>
+              </a:graphicData>
+            </a:graphic>
+          </wp:inline>
+        </w:drawing>
+      </w:r>
+    </w:p>
+    <w:p>
+      <w:pPr>
+        <w:jc w:val="center"/>
+      </w:pPr>
+      <w:r>
+        <w:rPr>
+          <w:rFonts w:ascii="Times New Roman" w:hAnsi="Times New Roman" w:cs="Times New Roman" w:eastAsia="Times New Roman"/>
+          <w:b w:val="0"/>
+          <w:i/>
+          <w:sz w:val="20"/>
+        </w:rPr>
+        <w:t>Hình 3.3 — Bảng điều khiển của quản lý: số liệu tổng hợp và danh sách cảnh báo bất thường sinh ra từ bốn quy tắc R1–R4</w:t>
+      </w:r>
+    </w:p>
+    <w:p/>
+    <w:p>
       <w:r>
         <w:rPr>
           <w:rFonts w:ascii="Times New Roman" w:hAnsi="Times New Roman" w:cs="Times New Roman" w:eastAsia="Times New Roman"/>
@@ -13176,7 +14720,7 @@
         <w:drawing>
           <wp:inline xmlns:a="http://schemas.openxmlformats.org/drawingml/2006/main" xmlns:pic="http://schemas.openxmlformats.org/drawingml/2006/picture">
             <wp:extent cx="5486400" cy="2955030"/>
-            <wp:docPr id="9" name="Picture 9"/>
+            <wp:docPr id="11" name="Picture 11"/>
             <wp:cNvGraphicFramePr>
               <a:graphicFrameLocks noChangeAspect="1"/>
             </wp:cNvGraphicFramePr>
@@ -13523,6 +15067,397 @@
                 <w:sz w:val="20"/>
               </w:rPr>
               <w:t>Chấm công lại sau 3 phút ở vị trí cách 200 km → phát hiện bất thường; cùng toạ độ → không cảnh báo</w:t>
+            </w:r>
+          </w:p>
+        </w:tc>
+      </w:tr>
+    </w:tbl>
+    <w:p/>
+    <w:p/>
+    <w:p>
+      <w:r>
+        <w:rPr>
+          <w:rFonts w:ascii="Times New Roman" w:hAnsi="Times New Roman" w:cs="Times New Roman" w:eastAsia="Times New Roman"/>
+          <w:b/>
+          <w:i w:val="0"/>
+          <w:sz w:val="26"/>
+        </w:rPr>
+        <w:t>Kiểm chứng toàn hệ thống</w:t>
+      </w:r>
+    </w:p>
+    <w:p>
+      <w:pPr>
+        <w:ind w:firstLine="432"/>
+        <w:jc w:val="both"/>
+      </w:pPr>
+      <w:r>
+        <w:rPr>
+          <w:rFonts w:ascii="Times New Roman" w:hAnsi="Times New Roman" w:cs="Times New Roman" w:eastAsia="Times New Roman"/>
+          <w:b w:val="0"/>
+          <w:i w:val="0"/>
+          <w:sz w:val="26"/>
+        </w:rPr>
+        <w:t>Sau khi hoàn thiện máy chủ và giao diện, các luồng nghiệp vụ được chạy thử đầu cuối qua API thật trên cơ sở dữ liệu thật. Kết quả cho thấy bốn quy tắc phát hiện bất thường đều hoạt động, phân quyền chặn đúng, và luồng giải trình khép kín.</w:t>
+      </w:r>
+    </w:p>
+    <w:p>
+      <w:pPr>
+        <w:jc w:val="center"/>
+      </w:pPr>
+      <w:r>
+        <w:rPr>
+          <w:rFonts w:ascii="Times New Roman" w:hAnsi="Times New Roman" w:cs="Times New Roman" w:eastAsia="Times New Roman"/>
+          <w:b w:val="0"/>
+          <w:i/>
+          <w:sz w:val="20"/>
+        </w:rPr>
+        <w:t>Bảng 4.3 — Kết quả kiểm thử đầu cuối trên hệ thống đã cài đặt</w:t>
+      </w:r>
+    </w:p>
+    <w:tbl>
+      <w:tblPr>
+        <w:tblStyle w:val="TableGrid"/>
+        <w:tblW w:type="auto" w:w="0"/>
+        <w:tblLook w:firstColumn="1" w:firstRow="1" w:lastColumn="0" w:lastRow="0" w:noHBand="0" w:noVBand="1" w:val="04A0"/>
+      </w:tblPr>
+      <w:tblGrid>
+        <w:gridCol w:w="4535"/>
+        <w:gridCol w:w="4535"/>
+      </w:tblGrid>
+      <w:tr>
+        <w:tc>
+          <w:tcPr>
+            <w:tcW w:type="dxa" w:w="3888"/>
+          </w:tcPr>
+          <w:p>
+            <w:r>
+              <w:rPr>
+                <w:rFonts w:ascii="Times New Roman" w:hAnsi="Times New Roman" w:cs="Times New Roman" w:eastAsia="Times New Roman"/>
+                <w:sz w:val="26"/>
+              </w:rPr>
+            </w:r>
+            <w:r>
+              <w:rPr>
+                <w:rFonts w:ascii="Times New Roman" w:hAnsi="Times New Roman" w:cs="Times New Roman" w:eastAsia="Times New Roman"/>
+                <w:b/>
+                <w:sz w:val="20"/>
+              </w:rPr>
+              <w:t>Kịch bản kiểm thử</w:t>
+            </w:r>
+          </w:p>
+        </w:tc>
+        <w:tc>
+          <w:tcPr>
+            <w:tcW w:type="dxa" w:w="4896"/>
+          </w:tcPr>
+          <w:p>
+            <w:r>
+              <w:rPr>
+                <w:rFonts w:ascii="Times New Roman" w:hAnsi="Times New Roman" w:cs="Times New Roman" w:eastAsia="Times New Roman"/>
+                <w:sz w:val="26"/>
+              </w:rPr>
+            </w:r>
+            <w:r>
+              <w:rPr>
+                <w:rFonts w:ascii="Times New Roman" w:hAnsi="Times New Roman" w:cs="Times New Roman" w:eastAsia="Times New Roman"/>
+                <w:b/>
+                <w:sz w:val="20"/>
+              </w:rPr>
+              <w:t>Kết quả hệ thống trả về</w:t>
+            </w:r>
+          </w:p>
+        </w:tc>
+      </w:tr>
+      <w:tr>
+        <w:tc>
+          <w:tcPr>
+            <w:tcW w:type="dxa" w:w="3888"/>
+          </w:tcPr>
+          <w:p>
+            <w:r>
+              <w:rPr>
+                <w:rFonts w:ascii="Times New Roman" w:hAnsi="Times New Roman" w:cs="Times New Roman" w:eastAsia="Times New Roman"/>
+                <w:sz w:val="26"/>
+              </w:rPr>
+            </w:r>
+            <w:r>
+              <w:rPr>
+                <w:rFonts w:ascii="Times New Roman" w:hAnsi="Times New Roman" w:cs="Times New Roman" w:eastAsia="Times New Roman"/>
+                <w:sz w:val="20"/>
+              </w:rPr>
+              <w:t>Chấm công đúng tầng 6</w:t>
+            </w:r>
+          </w:p>
+        </w:tc>
+        <w:tc>
+          <w:tcPr>
+            <w:tcW w:type="dxa" w:w="4896"/>
+          </w:tcPr>
+          <w:p>
+            <w:r>
+              <w:rPr>
+                <w:rFonts w:ascii="Times New Roman" w:hAnsi="Times New Roman" w:cs="Times New Roman" w:eastAsia="Times New Roman"/>
+                <w:sz w:val="26"/>
+              </w:rPr>
+            </w:r>
+            <w:r>
+              <w:rPr>
+                <w:rFonts w:ascii="Times New Roman" w:hAnsi="Times New Roman" w:cs="Times New Roman" w:eastAsia="Times New Roman"/>
+                <w:sz w:val="20"/>
+              </w:rPr>
+              <w:t>HOP_LE</w:t>
+            </w:r>
+          </w:p>
+        </w:tc>
+      </w:tr>
+      <w:tr>
+        <w:tc>
+          <w:tcPr>
+            <w:tcW w:type="dxa" w:w="3888"/>
+          </w:tcPr>
+          <w:p>
+            <w:r>
+              <w:rPr>
+                <w:rFonts w:ascii="Times New Roman" w:hAnsi="Times New Roman" w:cs="Times New Roman" w:eastAsia="Times New Roman"/>
+                <w:sz w:val="26"/>
+              </w:rPr>
+            </w:r>
+            <w:r>
+              <w:rPr>
+                <w:rFonts w:ascii="Times New Roman" w:hAnsi="Times New Roman" w:cs="Times New Roman" w:eastAsia="Times New Roman"/>
+                <w:sz w:val="20"/>
+              </w:rPr>
+              <w:t>Khai báo tầng 22 trong khi thuê tầng 5–8</w:t>
+            </w:r>
+          </w:p>
+        </w:tc>
+        <w:tc>
+          <w:tcPr>
+            <w:tcW w:type="dxa" w:w="4896"/>
+          </w:tcPr>
+          <w:p>
+            <w:r>
+              <w:rPr>
+                <w:rFonts w:ascii="Times New Roman" w:hAnsi="Times New Roman" w:cs="Times New Roman" w:eastAsia="Times New Roman"/>
+                <w:sz w:val="26"/>
+              </w:rPr>
+            </w:r>
+            <w:r>
+              <w:rPr>
+                <w:rFonts w:ascii="Times New Roman" w:hAnsi="Times New Roman" w:cs="Times New Roman" w:eastAsia="Times New Roman"/>
+                <w:sz w:val="20"/>
+              </w:rPr>
+              <w:t>NGHI_NGO, kèm cảnh báo R1: lệch 62,78 m tương đương 13,5 tầng</w:t>
+            </w:r>
+          </w:p>
+        </w:tc>
+      </w:tr>
+      <w:tr>
+        <w:tc>
+          <w:tcPr>
+            <w:tcW w:type="dxa" w:w="3888"/>
+          </w:tcPr>
+          <w:p>
+            <w:r>
+              <w:rPr>
+                <w:rFonts w:ascii="Times New Roman" w:hAnsi="Times New Roman" w:cs="Times New Roman" w:eastAsia="Times New Roman"/>
+                <w:sz w:val="26"/>
+              </w:rPr>
+            </w:r>
+            <w:r>
+              <w:rPr>
+                <w:rFonts w:ascii="Times New Roman" w:hAnsi="Times New Roman" w:cs="Times New Roman" w:eastAsia="Times New Roman"/>
+                <w:sz w:val="20"/>
+              </w:rPr>
+              <w:t>Chấm công ở vị trí cách toà nhà 270 m</w:t>
+            </w:r>
+          </w:p>
+        </w:tc>
+        <w:tc>
+          <w:tcPr>
+            <w:tcW w:type="dxa" w:w="4896"/>
+          </w:tcPr>
+          <w:p>
+            <w:r>
+              <w:rPr>
+                <w:rFonts w:ascii="Times New Roman" w:hAnsi="Times New Roman" w:cs="Times New Roman" w:eastAsia="Times New Roman"/>
+                <w:sz w:val="26"/>
+              </w:rPr>
+            </w:r>
+            <w:r>
+              <w:rPr>
+                <w:rFonts w:ascii="Times New Roman" w:hAnsi="Times New Roman" w:cs="Times New Roman" w:eastAsia="Times New Roman"/>
+                <w:sz w:val="20"/>
+              </w:rPr>
+              <w:t>NGOAI_VUNG, kèm cảnh báo R2 về dịch chuyển bất khả thi</w:t>
+            </w:r>
+          </w:p>
+        </w:tc>
+      </w:tr>
+      <w:tr>
+        <w:tc>
+          <w:tcPr>
+            <w:tcW w:type="dxa" w:w="3888"/>
+          </w:tcPr>
+          <w:p>
+            <w:r>
+              <w:rPr>
+                <w:rFonts w:ascii="Times New Roman" w:hAnsi="Times New Roman" w:cs="Times New Roman" w:eastAsia="Times New Roman"/>
+                <w:sz w:val="26"/>
+              </w:rPr>
+            </w:r>
+            <w:r>
+              <w:rPr>
+                <w:rFonts w:ascii="Times New Roman" w:hAnsi="Times New Roman" w:cs="Times New Roman" w:eastAsia="Times New Roman"/>
+                <w:sz w:val="20"/>
+              </w:rPr>
+              <w:t>Thiết bị báo độ chính xác 0,3 m</w:t>
+            </w:r>
+          </w:p>
+        </w:tc>
+        <w:tc>
+          <w:tcPr>
+            <w:tcW w:type="dxa" w:w="4896"/>
+          </w:tcPr>
+          <w:p>
+            <w:r>
+              <w:rPr>
+                <w:rFonts w:ascii="Times New Roman" w:hAnsi="Times New Roman" w:cs="Times New Roman" w:eastAsia="Times New Roman"/>
+                <w:sz w:val="26"/>
+              </w:rPr>
+            </w:r>
+            <w:r>
+              <w:rPr>
+                <w:rFonts w:ascii="Times New Roman" w:hAnsi="Times New Roman" w:cs="Times New Roman" w:eastAsia="Times New Roman"/>
+                <w:sz w:val="20"/>
+              </w:rPr>
+              <w:t>Cảnh báo R3: độ chính xác nhỏ bất thường, nghi giả lập vị trí</w:t>
+            </w:r>
+          </w:p>
+        </w:tc>
+      </w:tr>
+      <w:tr>
+        <w:tc>
+          <w:tcPr>
+            <w:tcW w:type="dxa" w:w="3888"/>
+          </w:tcPr>
+          <w:p>
+            <w:r>
+              <w:rPr>
+                <w:rFonts w:ascii="Times New Roman" w:hAnsi="Times New Roman" w:cs="Times New Roman" w:eastAsia="Times New Roman"/>
+                <w:sz w:val="26"/>
+              </w:rPr>
+            </w:r>
+            <w:r>
+              <w:rPr>
+                <w:rFonts w:ascii="Times New Roman" w:hAnsi="Times New Roman" w:cs="Times New Roman" w:eastAsia="Times New Roman"/>
+                <w:sz w:val="20"/>
+              </w:rPr>
+              <w:t>Nhân viên khác dùng lại cùng một thiết bị</w:t>
+            </w:r>
+          </w:p>
+        </w:tc>
+        <w:tc>
+          <w:tcPr>
+            <w:tcW w:type="dxa" w:w="4896"/>
+          </w:tcPr>
+          <w:p>
+            <w:r>
+              <w:rPr>
+                <w:rFonts w:ascii="Times New Roman" w:hAnsi="Times New Roman" w:cs="Times New Roman" w:eastAsia="Times New Roman"/>
+                <w:sz w:val="26"/>
+              </w:rPr>
+            </w:r>
+            <w:r>
+              <w:rPr>
+                <w:rFonts w:ascii="Times New Roman" w:hAnsi="Times New Roman" w:cs="Times New Roman" w:eastAsia="Times New Roman"/>
+                <w:sz w:val="20"/>
+              </w:rPr>
+              <w:t>Cảnh báo R4: thiết bị vừa được nhân viên khác dùng để chấm công</w:t>
+            </w:r>
+          </w:p>
+        </w:tc>
+      </w:tr>
+      <w:tr>
+        <w:tc>
+          <w:tcPr>
+            <w:tcW w:type="dxa" w:w="3888"/>
+          </w:tcPr>
+          <w:p>
+            <w:r>
+              <w:rPr>
+                <w:rFonts w:ascii="Times New Roman" w:hAnsi="Times New Roman" w:cs="Times New Roman" w:eastAsia="Times New Roman"/>
+                <w:sz w:val="26"/>
+              </w:rPr>
+            </w:r>
+            <w:r>
+              <w:rPr>
+                <w:rFonts w:ascii="Times New Roman" w:hAnsi="Times New Roman" w:cs="Times New Roman" w:eastAsia="Times New Roman"/>
+                <w:sz w:val="20"/>
+              </w:rPr>
+              <w:t>Nhân viên gọi API dành cho quản lý</w:t>
+            </w:r>
+          </w:p>
+        </w:tc>
+        <w:tc>
+          <w:tcPr>
+            <w:tcW w:type="dxa" w:w="4896"/>
+          </w:tcPr>
+          <w:p>
+            <w:r>
+              <w:rPr>
+                <w:rFonts w:ascii="Times New Roman" w:hAnsi="Times New Roman" w:cs="Times New Roman" w:eastAsia="Times New Roman"/>
+                <w:sz w:val="26"/>
+              </w:rPr>
+            </w:r>
+            <w:r>
+              <w:rPr>
+                <w:rFonts w:ascii="Times New Roman" w:hAnsi="Times New Roman" w:cs="Times New Roman" w:eastAsia="Times New Roman"/>
+                <w:sz w:val="20"/>
+              </w:rPr>
+              <w:t>HTTP 403 — không đủ quyền thực hiện chức năng này</w:t>
+            </w:r>
+          </w:p>
+        </w:tc>
+      </w:tr>
+      <w:tr>
+        <w:tc>
+          <w:tcPr>
+            <w:tcW w:type="dxa" w:w="3888"/>
+          </w:tcPr>
+          <w:p>
+            <w:r>
+              <w:rPr>
+                <w:rFonts w:ascii="Times New Roman" w:hAnsi="Times New Roman" w:cs="Times New Roman" w:eastAsia="Times New Roman"/>
+                <w:sz w:val="26"/>
+              </w:rPr>
+            </w:r>
+            <w:r>
+              <w:rPr>
+                <w:rFonts w:ascii="Times New Roman" w:hAnsi="Times New Roman" w:cs="Times New Roman" w:eastAsia="Times New Roman"/>
+                <w:sz w:val="20"/>
+              </w:rPr>
+              <w:t>Quản lý duyệt đơn giải trình</w:t>
+            </w:r>
+          </w:p>
+        </w:tc>
+        <w:tc>
+          <w:tcPr>
+            <w:tcW w:type="dxa" w:w="4896"/>
+          </w:tcPr>
+          <w:p>
+            <w:r>
+              <w:rPr>
+                <w:rFonts w:ascii="Times New Roman" w:hAnsi="Times New Roman" w:cs="Times New Roman" w:eastAsia="Times New Roman"/>
+                <w:sz w:val="26"/>
+              </w:rPr>
+            </w:r>
+            <w:r>
+              <w:rPr>
+                <w:rFonts w:ascii="Times New Roman" w:hAnsi="Times New Roman" w:cs="Times New Roman" w:eastAsia="Times New Roman"/>
+                <w:sz w:val="20"/>
+              </w:rPr>
+              <w:t>Bản ghi chuyển từ NGOAI_VUNG sang HOP_LE, các cảnh báo liên quan được đóng, báo cáo công cập nhật theo</w:t>
             </w:r>
           </w:p>
         </w:tc>

</xml_diff>

<commit_message>
Checkpoint 2: mô hình dữ liệu, database, use case, DFD và sequence diagram
Sửa lỗi số liệu: spatial_ref_sys là bảng hệ thống của PostGIS, không thuộc lược
đồ đề tài. Con số "15 bảng" báo trước đây là sai — lược đồ thật có 14 bảng.
Đã loại bảng này khỏi mọi truy vấn và sửa lại con số trong Checkpoint 1, báo cáo
đồ án, db/README.md và README dự án.

Công cụ mới:
- tools/sinh_so_do_csdl.py  : đọc pg_catalog của CSDL đang chạy để sinh sơ đồ
  cơ sở dữ liệu và bảng mô tả — tài liệu không thể lệch khỏi hệ thống thật
- tools/so_do_checkpoint2.py: 10 sơ đồ Mermaid viết bám theo server/src/routes
- tools/build_checkpoint2.py: dựng báo cáo, lấy số liệu lược đồ từ JSON sinh ra

Báo cáo CHECKPOINT2 gồm 5 chương đúng yêu cầu: 27 heading, 12 bảng, 10 sơ đồ.
Lược đồ thật: 14 bảng, 81 cột, 18 khoá ngoại, 9 ràng buộc duy nhất, 13 chỉ mục.
</commit_message>
<xml_diff>
--- a/ie402-chamcong-3d/CHECKPOINT1-Cham-cong-dinh-vi-3D.docx
+++ b/ie402-chamcong-3d/CHECKPOINT1-Cham-cong-dinh-vi-3D.docx
@@ -13022,7 +13022,7 @@
                 <w:rFonts w:ascii="Times New Roman" w:hAnsi="Times New Roman" w:cs="Times New Roman" w:eastAsia="Times New Roman"/>
                 <w:sz w:val="20"/>
               </w:rPr>
-              <w:t>15 bảng, 4 hàm, 1 trigger; chứa toàn bộ logic không gian</w:t>
+              <w:t>14 bảng, 4 hàm, 1 trigger; chứa toàn bộ logic không gian</w:t>
             </w:r>
           </w:p>
         </w:tc>
@@ -14099,7 +14099,7 @@
               <a:graphicData uri="http://schemas.openxmlformats.org/drawingml/2006/picture">
                 <pic:pic>
                   <pic:nvPicPr>
-                    <pic:cNvPr id="0" name="03-app-cham-cong.png"/>
+                    <pic:cNvPr id="0" name="image.png"/>
                     <pic:cNvPicPr/>
                   </pic:nvPicPr>
                   <pic:blipFill>
@@ -14157,7 +14157,7 @@
               <a:graphicData uri="http://schemas.openxmlformats.org/drawingml/2006/picture">
                 <pic:pic>
                   <pic:nvPicPr>
-                    <pic:cNvPr id="0" name="04-app-quan-ly.png"/>
+                    <pic:cNvPr id="0" name="image.png"/>
                     <pic:cNvPicPr/>
                   </pic:nvPicPr>
                   <pic:blipFill>
@@ -14898,7 +14898,7 @@
                 <w:rFonts w:ascii="Times New Roman" w:hAnsi="Times New Roman" w:cs="Times New Roman" w:eastAsia="Times New Roman"/>
                 <w:sz w:val="20"/>
               </w:rPr>
-              <w:t>Thành công, tạo 15 bảng, 4 hàm và 1 trigger</w:t>
+              <w:t>Thành công, tạo 14 bảng, 4 hàm và 1 trigger</w:t>
             </w:r>
           </w:p>
         </w:tc>

</xml_diff>